<commit_message>
docs: hold-out pure-LLM baseline written into COMPSAC Table V and the experiment README
Co-Authored-By: Claude Fable 5.1 <noreply@anthropic.com>
</commit_message>
<xml_diff>
--- a/docs/papers/compsac-2027-zh.docx
+++ b/docs/papers/compsac-2027-zh.docx
@@ -4546,6 +4546,7 @@
           <w:p>
             <w:pPr>
               <w:pStyle w:val="TableCell"/>
+              <w:keepNext/>
               <w:ind w:firstLine="0"/>
               <w:jc w:val="left"/>
             </w:pPr>
@@ -4561,6 +4562,7 @@
           <w:p>
             <w:pPr>
               <w:pStyle w:val="TableCell"/>
+              <w:keepNext/>
               <w:ind w:firstLine="0"/>
               <w:jc w:val="left"/>
             </w:pPr>
@@ -4576,6 +4578,7 @@
           <w:p>
             <w:pPr>
               <w:pStyle w:val="TableCell"/>
+              <w:keepNext/>
               <w:ind w:firstLine="0"/>
               <w:jc w:val="left"/>
             </w:pPr>
@@ -4591,6 +4594,7 @@
           <w:p>
             <w:pPr>
               <w:pStyle w:val="TableCell"/>
+              <w:keepNext/>
               <w:ind w:firstLine="0"/>
               <w:jc w:val="left"/>
             </w:pPr>
@@ -4606,6 +4610,7 @@
           <w:p>
             <w:pPr>
               <w:pStyle w:val="TableCell"/>
+              <w:keepNext/>
               <w:ind w:firstLine="0"/>
               <w:jc w:val="left"/>
             </w:pPr>
@@ -4621,11 +4626,410 @@
           <w:p>
             <w:pPr>
               <w:pStyle w:val="TableCell"/>
+              <w:keepNext/>
               <w:ind w:firstLine="0"/>
               <w:jc w:val="left"/>
             </w:pPr>
             <w:r>
               <w:t xml:space="preserve">表 VII「修正後」；規則在這 7 個系統上歸納，不是 hold-out 數字（hold-out 見表 VIII）</w:t>
+            </w:r>
+          </w:p>
+        </w:tc>
+      </w:tr>
+      <w:tr>
+        <w:trPr>
+          <w:cantSplit/>
+        </w:trPr>
+        <w:tc>
+          <w:tcPr>
+            <w:tcW w:w="1250" w:type="dxa"/>
+          </w:tcPr>
+          <w:p>
+            <w:pPr>
+              <w:pStyle w:val="TableCell"/>
+              <w:keepNext/>
+              <w:ind w:firstLine="0"/>
+              <w:jc w:val="left"/>
+            </w:pPr>
+            <w:r>
+              <w:t xml:space="preserve">hold-out 5 系統：零檔案</w:t>
+            </w:r>
+          </w:p>
+        </w:tc>
+        <w:tc>
+          <w:tcPr>
+            <w:tcW w:w="1050" w:type="dxa"/>
+          </w:tcPr>
+          <w:p>
+            <w:pPr>
+              <w:pStyle w:val="TableCell"/>
+              <w:keepNext/>
+              <w:ind w:firstLine="0"/>
+              <w:jc w:val="left"/>
+            </w:pPr>
+            <w:r>
+              <w:t xml:space="preserve">repo 網址＋元件清單</w:t>
+            </w:r>
+          </w:p>
+        </w:tc>
+        <w:tc>
+          <w:tcPr>
+            <w:tcW w:w="420" w:type="dxa"/>
+          </w:tcPr>
+          <w:p>
+            <w:pPr>
+              <w:pStyle w:val="TableCell"/>
+              <w:keepNext/>
+              <w:ind w:firstLine="0"/>
+              <w:jc w:val="left"/>
+            </w:pPr>
+            <w:r>
+              <w:t xml:space="preserve">0.51</w:t>
+            </w:r>
+          </w:p>
+        </w:tc>
+        <w:tc>
+          <w:tcPr>
+            <w:tcW w:w="420" w:type="dxa"/>
+          </w:tcPr>
+          <w:p>
+            <w:pPr>
+              <w:pStyle w:val="TableCell"/>
+              <w:keepNext/>
+              <w:ind w:firstLine="0"/>
+              <w:jc w:val="left"/>
+            </w:pPr>
+            <w:r>
+              <w:t xml:space="preserve">0.61</w:t>
+            </w:r>
+          </w:p>
+        </w:tc>
+        <w:tc>
+          <w:tcPr>
+            <w:tcW w:w="420" w:type="dxa"/>
+          </w:tcPr>
+          <w:p>
+            <w:pPr>
+              <w:pStyle w:val="TableCell"/>
+              <w:keepNext/>
+              <w:ind w:firstLine="0"/>
+              <w:jc w:val="left"/>
+            </w:pPr>
+            <w:r>
+              <w:t xml:space="preserve">0.55</w:t>
+            </w:r>
+          </w:p>
+        </w:tc>
+        <w:tc>
+          <w:tcPr>
+            <w:tcW w:w="1480" w:type="dxa"/>
+          </w:tcPr>
+          <w:p>
+            <w:pPr>
+              <w:pStyle w:val="TableCell"/>
+              <w:keepNext/>
+              <w:ind w:firstLine="0"/>
+              <w:jc w:val="left"/>
+            </w:pPr>
+            <w:r>
+              <w:t xml:space="preserve">越冷門越差：yas 0.37／0.29、opentelemetry-demo 0.35／0.37</w:t>
+            </w:r>
+          </w:p>
+        </w:tc>
+      </w:tr>
+      <w:tr>
+        <w:trPr>
+          <w:cantSplit/>
+        </w:trPr>
+        <w:tc>
+          <w:tcPr>
+            <w:tcW w:w="1250" w:type="dxa"/>
+          </w:tcPr>
+          <w:p>
+            <w:pPr>
+              <w:pStyle w:val="TableCell"/>
+              <w:keepNext/>
+              <w:ind w:firstLine="0"/>
+              <w:jc w:val="left"/>
+            </w:pPr>
+            <w:r>
+              <w:t xml:space="preserve">hold-out 5 系統：給檔案</w:t>
+            </w:r>
+          </w:p>
+        </w:tc>
+        <w:tc>
+          <w:tcPr>
+            <w:tcW w:w="1050" w:type="dxa"/>
+          </w:tcPr>
+          <w:p>
+            <w:pPr>
+              <w:pStyle w:val="TableCell"/>
+              <w:keepNext/>
+              <w:ind w:firstLine="0"/>
+              <w:jc w:val="left"/>
+            </w:pPr>
+            <w:r>
+              <w:t xml:space="preserve">元件清單＋預算內檔案</w:t>
+            </w:r>
+          </w:p>
+        </w:tc>
+        <w:tc>
+          <w:tcPr>
+            <w:tcW w:w="420" w:type="dxa"/>
+          </w:tcPr>
+          <w:p>
+            <w:pPr>
+              <w:pStyle w:val="TableCell"/>
+              <w:keepNext/>
+              <w:ind w:firstLine="0"/>
+              <w:jc w:val="left"/>
+            </w:pPr>
+            <w:r>
+              <w:t xml:space="preserve">0.79</w:t>
+            </w:r>
+          </w:p>
+        </w:tc>
+        <w:tc>
+          <w:tcPr>
+            <w:tcW w:w="420" w:type="dxa"/>
+          </w:tcPr>
+          <w:p>
+            <w:pPr>
+              <w:pStyle w:val="TableCell"/>
+              <w:keepNext/>
+              <w:ind w:firstLine="0"/>
+              <w:jc w:val="left"/>
+            </w:pPr>
+            <w:r>
+              <w:t xml:space="preserve">0.88</w:t>
+            </w:r>
+          </w:p>
+        </w:tc>
+        <w:tc>
+          <w:tcPr>
+            <w:tcW w:w="420" w:type="dxa"/>
+          </w:tcPr>
+          <w:p>
+            <w:pPr>
+              <w:pStyle w:val="TableCell"/>
+              <w:keepNext/>
+              <w:ind w:firstLine="0"/>
+              <w:jc w:val="left"/>
+            </w:pPr>
+            <w:r>
+              <w:t xml:space="preserve">0.83</w:t>
+            </w:r>
+          </w:p>
+        </w:tc>
+        <w:tc>
+          <w:tcPr>
+            <w:tcW w:w="1480" w:type="dxa"/>
+          </w:tcPr>
+          <w:p>
+            <w:pPr>
+              <w:pStyle w:val="TableCell"/>
+              <w:keepNext/>
+              <w:ind w:firstLine="0"/>
+              <w:jc w:val="left"/>
+            </w:pPr>
+            <w:r>
+              <w:t xml:space="preserve">2 次輸出陷入迴圈（mall-swarm、yas）</w:t>
+            </w:r>
+          </w:p>
+        </w:tc>
+      </w:tr>
+      <w:tr>
+        <w:trPr>
+          <w:cantSplit/>
+        </w:trPr>
+        <w:tc>
+          <w:tcPr>
+            <w:tcW w:w="1250" w:type="dxa"/>
+          </w:tcPr>
+          <w:p>
+            <w:pPr>
+              <w:pStyle w:val="TableCell"/>
+              <w:keepNext/>
+              <w:ind w:firstLine="0"/>
+              <w:jc w:val="left"/>
+            </w:pPr>
+            <w:r>
+              <w:t xml:space="preserve">hold-out 5 系統：給檔案、不給名稱（嚴格對名）</w:t>
+            </w:r>
+          </w:p>
+        </w:tc>
+        <w:tc>
+          <w:tcPr>
+            <w:tcW w:w="1050" w:type="dxa"/>
+          </w:tcPr>
+          <w:p>
+            <w:pPr>
+              <w:pStyle w:val="TableCell"/>
+              <w:keepNext/>
+              <w:ind w:firstLine="0"/>
+              <w:jc w:val="left"/>
+            </w:pPr>
+            <w:r>
+              <w:t xml:space="preserve">預算內檔案</w:t>
+            </w:r>
+          </w:p>
+        </w:tc>
+        <w:tc>
+          <w:tcPr>
+            <w:tcW w:w="420" w:type="dxa"/>
+          </w:tcPr>
+          <w:p>
+            <w:pPr>
+              <w:pStyle w:val="TableCell"/>
+              <w:keepNext/>
+              <w:ind w:firstLine="0"/>
+              <w:jc w:val="left"/>
+            </w:pPr>
+            <w:r>
+              <w:t xml:space="preserve">0.89</w:t>
+            </w:r>
+          </w:p>
+        </w:tc>
+        <w:tc>
+          <w:tcPr>
+            <w:tcW w:w="420" w:type="dxa"/>
+          </w:tcPr>
+          <w:p>
+            <w:pPr>
+              <w:pStyle w:val="TableCell"/>
+              <w:keepNext/>
+              <w:ind w:firstLine="0"/>
+              <w:jc w:val="left"/>
+            </w:pPr>
+            <w:r>
+              <w:t xml:space="preserve">0.86</w:t>
+            </w:r>
+          </w:p>
+        </w:tc>
+        <w:tc>
+          <w:tcPr>
+            <w:tcW w:w="420" w:type="dxa"/>
+          </w:tcPr>
+          <w:p>
+            <w:pPr>
+              <w:pStyle w:val="TableCell"/>
+              <w:keepNext/>
+              <w:ind w:firstLine="0"/>
+              <w:jc w:val="left"/>
+            </w:pPr>
+            <w:r>
+              <w:t xml:space="preserve">0.87</w:t>
+            </w:r>
+          </w:p>
+        </w:tc>
+        <w:tc>
+          <w:tcPr>
+            <w:tcW w:w="1480" w:type="dxa"/>
+          </w:tcPr>
+          <w:p>
+            <w:pPr>
+              <w:pStyle w:val="TableCell"/>
+              <w:keepNext/>
+              <w:ind w:firstLine="0"/>
+              <w:jc w:val="left"/>
+            </w:pPr>
+            <w:r>
+              <w:t xml:space="preserve">這 5 個系統的名稱多半就是 Compose 服務名，對名問題比 7 個歸納用系統小</w:t>
+            </w:r>
+          </w:p>
+        </w:tc>
+      </w:tr>
+      <w:tr>
+        <w:trPr>
+          <w:cantSplit/>
+        </w:trPr>
+        <w:tc>
+          <w:tcPr>
+            <w:tcW w:w="1250" w:type="dxa"/>
+          </w:tcPr>
+          <w:p>
+            <w:pPr>
+              <w:pStyle w:val="TableCell"/>
+              <w:ind w:firstLine="0"/>
+              <w:jc w:val="left"/>
+            </w:pPr>
+            <w:r>
+              <w:t xml:space="preserve">hold-out 5 系統：DepWeaver 靜態層（46 條）</w:t>
+            </w:r>
+          </w:p>
+        </w:tc>
+        <w:tc>
+          <w:tcPr>
+            <w:tcW w:w="1050" w:type="dxa"/>
+          </w:tcPr>
+          <w:p>
+            <w:pPr>
+              <w:pStyle w:val="TableCell"/>
+              <w:ind w:firstLine="0"/>
+              <w:jc w:val="left"/>
+            </w:pPr>
+            <w:r>
+              <w:t xml:space="preserve">不呼叫 LLM</w:t>
+            </w:r>
+          </w:p>
+        </w:tc>
+        <w:tc>
+          <w:tcPr>
+            <w:tcW w:w="420" w:type="dxa"/>
+          </w:tcPr>
+          <w:p>
+            <w:pPr>
+              <w:pStyle w:val="TableCell"/>
+              <w:ind w:firstLine="0"/>
+              <w:jc w:val="left"/>
+            </w:pPr>
+            <w:r>
+              <w:t xml:space="preserve">0.96</w:t>
+            </w:r>
+          </w:p>
+        </w:tc>
+        <w:tc>
+          <w:tcPr>
+            <w:tcW w:w="420" w:type="dxa"/>
+          </w:tcPr>
+          <w:p>
+            <w:pPr>
+              <w:pStyle w:val="TableCell"/>
+              <w:ind w:firstLine="0"/>
+              <w:jc w:val="left"/>
+            </w:pPr>
+            <w:r>
+              <w:t xml:space="preserve">0.93</w:t>
+            </w:r>
+          </w:p>
+        </w:tc>
+        <w:tc>
+          <w:tcPr>
+            <w:tcW w:w="420" w:type="dxa"/>
+          </w:tcPr>
+          <w:p>
+            <w:pPr>
+              <w:pStyle w:val="TableCell"/>
+              <w:ind w:firstLine="0"/>
+              <w:jc w:val="left"/>
+            </w:pPr>
+            <w:r>
+              <w:t xml:space="preserve">0.94</w:t>
+            </w:r>
+          </w:p>
+        </w:tc>
+        <w:tc>
+          <w:tcPr>
+            <w:tcW w:w="1480" w:type="dxa"/>
+          </w:tcPr>
+          <w:p>
+            <w:pPr>
+              <w:pStyle w:val="TableCell"/>
+              <w:ind w:firstLine="0"/>
+              <w:jc w:val="left"/>
+            </w:pPr>
+            <w:r>
+              <w:t xml:space="preserve">表 VIII 最右欄；對這 5 個系統而言不是 hold-out 數字</w:t>
             </w:r>
           </w:p>
         </w:tc>
@@ -4649,7 +5053,7 @@
         <w:t xml:space="preserve">結果。</w:t>
       </w:r>
       <w:r>
-        <w:t xml:space="preserve">第一，不給事實時，LLM 畫不出正確的圖：零檔案組平均後沒有一個系統的 P 與 R 同時為 1.00。錯誤的型態有三種：套用別的系統的架構（robot-shop 把負載產生器畫成呼叫 6 個服務；TeaStore 把「全部裝在一個 pod」的部署變體畫成呼叫者）、資料庫接錯（Bank of Anthos 把 ledgerwriter 接到 accounts-db）、方向相反（piggymetrics 4 條）。這 7 個系統都公開在 GitHub 上、很可能在訓練資料裡，對私有系統這一組只會更差。第二，給了檔案之後，LLM 與當時的靜態層各有勝負：在靜態層 recall 較低的三個系統上它都較好（TeaStore 以 enum 常數指定目標的業務呼叫邊，LLM 3 次平均 recall 0.67（三次分別是 1.00、1.00、0.00），靜態層 0/7；ecommerce 只寫了 localhost 預設值的控制平面邊，0.81 對 0.28；robot-shop 的業務呼叫邊，1.00 對 0.40），但在 piggymetrics 較差（recall 0.71 對 1.00；3 次都遺漏的 7 條是 gateway 到 4 個服務、notification 與 statistics 到 auth-service 的業務呼叫邊，以及 turbine 到 rabbitmq）。第三，LLM 的輸出有三個分數看不出來的問題，而且都在這 63 次執行中出現：（i）沒有一條邊附出處，無法像 RQ1 那樣逐條查證；（ii）temperature 0 下同一個 prompt 三次結果不同（TeaStore 給檔案組 recall 0.46–1.00），Bank of Anthos 不給名稱組有兩次陷入迴圈，同樣 12 條邊重複輸出 1,417 次直到輸出上限；（iii）名稱由模型決定時，ecommerce 三次都用 Compose 的 container_name（user-service-container）而不是服務名，嚴格對名下 F1 為 0.00、寬鬆對名下為 0.96。分數的差距幾乎全部是名稱問題，而這正是第 III-F 節請操作者確認的問題。第四，事後逐條追查 LLM 贏過靜態層的那三個系統，靜態層輸的地方沒有一處是靜態分析的極限，都是規則缺口（第 IV-C 節的錯誤分析）；假想敵因此同時是找規則缺口的方法。</w:t>
+        <w:t xml:space="preserve">第一，不給事實時，LLM 畫不出正確的圖：零檔案組平均後沒有一個系統的 P 與 R 同時為 1.00。錯誤的型態有三種：套用別的系統的架構（robot-shop 把負載產生器畫成呼叫 6 個服務；TeaStore 把「全部裝在一個 pod」的部署變體畫成呼叫者）、資料庫接錯（Bank of Anthos 把 ledgerwriter 接到 accounts-db）、方向相反（piggymetrics 4 條）。這 7 個系統都公開在 GitHub 上、很可能在訓練資料裡，對私有系統這一組只會更差。第二，給了檔案之後，LLM 與當時的靜態層各有勝負：在靜態層 recall 較低的三個系統上它都較好（TeaStore 以 enum 常數指定目標的業務呼叫邊，LLM 3 次平均 recall 0.67（三次分別是 1.00、1.00、0.00），靜態層 0/7；ecommerce 只寫了 localhost 預設值的控制平面邊，0.81 對 0.28；robot-shop 的業務呼叫邊，1.00 對 0.40），但在 piggymetrics 較差（recall 0.71 對 1.00；3 次都遺漏的 7 條是 gateway 到 4 個服務、notification 與 statistics 到 auth-service 的業務呼叫邊，以及 turbine 到 rabbitmq）。第三，LLM 的輸出有三個分數看不出來的問題，而且都在這 63 次執行中出現：（i）沒有一條邊附出處，無法像 RQ1 那樣逐條查證；（ii）temperature 0 下同一個 prompt 三次結果不同（TeaStore 給檔案組 recall 0.46–1.00），Bank of Anthos 不給名稱組有兩次陷入迴圈，同樣 12 條邊重複輸出 1,417 次直到輸出上限；（iii）名稱由模型決定時，ecommerce 三次都用 Compose 的 container_name（user-service-container）而不是服務名，嚴格對名下 F1 為 0.00、寬鬆對名下為 0.96。分數的差距幾乎全部是名稱問題，而這正是第 III-F 節請操作者確認的問題。第四，事後逐條追查 LLM 贏過靜態層的那三個系統，靜態層輸的地方沒有一處是靜態分析的極限，都是規則缺口（第 IV-C 節的錯誤分析）；假想敵因此同時是找規則缺口的方法。第五，在 5 個 hold-out 系統上重複同一組對照（表 V 下半，45 次呼叫）：零檔案組 F1 只有 0.55，而且知名度越低越差（yas 0.37／0.29）；給檔案組 0.83，低於 7 個歸納用系統的 0.90，因為 yas 的 17 個模組加 Helm 與 Compose 超過預算、三次都只畫到一半（0.58／0.50）。LLM 唯一明顯勝過靜態層的是 hotelReservation（1.00 對 0.71）：它讀得懂 Go 程式碼裡的 Consul 名稱 srv-search 指的是 search，正是第 IV-C 節所說靜態層真正的邊界。</w:t>
       </w:r>
     </w:p>
     <w:p>
@@ -8959,7 +9363,7 @@
         <w:t xml:space="preserve">外部效度：</w:t>
       </w:r>
       <w:r>
-        <w:t xml:space="preserve">歸納用的系統以 Java 與 Spring 為主；hold-out 加入了 Go、.NET、Kotlin、Rust 等語言，但這些語言只有薄表面抽取。含缺口補齊的完整執行期驗證只有 Bank of Anthos 一個案例。RQ0 的假想敵只在 7 個歸納用系統上執行，尚未在 hold-out 系統上重複。</w:t>
+        <w:t xml:space="preserve">歸納用的系統以 Java 與 Spring 為主；hold-out 加入了 Go、.NET、Kotlin、Rust 等語言，但這些語言只有薄表面抽取。含缺口補齊的完整執行期驗證只有 Bank of Anthos 一個案例。RQ0 的假想敵在 7 個歸納用系統與 5 個 hold-out 系統上各執行一次，但 hold-out 那一組比較的是第三輪規則後的靜態層。</w:t>
       </w:r>
       <w:r>
         <w:rPr>
@@ -8995,7 +9399,7 @@
         <w:pStyle w:val="BodyText"/>
       </w:pPr>
       <w:r>
-        <w:t xml:space="preserve">本文提出 DepWeaver，以三來源融合、三級信心等級與逐條出處建構微服務相依圖，讓圖、覆蓋率與報告由同一個模型產生而彼此一致，並在自動手段用盡時才於 ChatOps 對話中詢問操作者。在 19 個開源系統與 1 個私有系統上，靜態層對第三方參考邊集合的吻合率為 0.98；三輪「歸納、hold-out」的評估顯示規則的轉移是部分的、每組未見過的系統都暴露新寫法，靜態層的 recall 是寫法涵蓋率而非分析的極限；作為假想敵，不給任何檔案的 LLM 直接畫圖 F1 為 0.70，給了 repo 檔案後為 0.90，但沒有出處、三次執行結果不同、自行決定的名稱有 85 個對不上；在一個真實部署（Bank of Anthos）上，融合執行期觀測後業務呼叫與資料層覆蓋率都達到 100%；關閉 repo 範例來源時，最後兩條業務邊由對話補齊。未來工作包括：在 hold-out 系統上重複假想敵對照；請不熟悉受測系統的操作者回答名稱問題，量測詢問操作者的實際正確率；在 TeaStore 上完成執行期驗證，量化靜態與執行期的互補；以小型使用者研究檢驗信心分級是否改善讀者的決策；以及以相依圖產生部署順序，並以執行期證據驗證。</w:t>
+        <w:t xml:space="preserve">本文提出 DepWeaver，以三來源融合、三級信心等級與逐條出處建構微服務相依圖，讓圖、覆蓋率與報告由同一個模型產生而彼此一致，並在自動手段用盡時才於 ChatOps 對話中詢問操作者。在 19 個開源系統與 1 個私有系統上，靜態層對第三方參考邊集合的吻合率為 0.98；三輪「歸納、hold-out」的評估顯示規則的轉移是部分的、每組未見過的系統都暴露新寫法，靜態層的 recall 是寫法涵蓋率而非分析的極限；作為假想敵，不給任何檔案的 LLM 直接畫圖 F1 為 0.70，給了 repo 檔案後為 0.90，但沒有出處、三次執行結果不同、自行決定的名稱有 85 個對不上；在一個真實部署（Bank of Anthos）上，融合執行期觀測後業務呼叫與資料層覆蓋率都達到 100%；關閉 repo 範例來源時，最後兩條業務邊由對話補齊。未來工作包括：請不熟悉受測系統的操作者回答名稱問題，量測詢問操作者的實際正確率；在 TeaStore 上完成執行期驗證，量化靜態與執行期的互補；以小型使用者研究檢驗信心分級是否改善讀者的決策；以及以相依圖產生部署順序，並以執行期證據驗證。</w:t>
       </w:r>
     </w:p>
     <w:p>

</xml_diff>

<commit_message>
docs: pure-LLM baseline on the private system (totals only) into COMPSAC Table V
Co-Authored-By: Claude Fable 5.1 <noreply@anthropic.com>
</commit_message>
<xml_diff>
--- a/docs/papers/compsac-2027-zh.docx
+++ b/docs/papers/compsac-2027-zh.docx
@@ -4950,6 +4950,7 @@
           <w:p>
             <w:pPr>
               <w:pStyle w:val="TableCell"/>
+              <w:keepNext/>
               <w:ind w:firstLine="0"/>
               <w:jc w:val="left"/>
             </w:pPr>
@@ -4965,6 +4966,7 @@
           <w:p>
             <w:pPr>
               <w:pStyle w:val="TableCell"/>
+              <w:keepNext/>
               <w:ind w:firstLine="0"/>
               <w:jc w:val="left"/>
             </w:pPr>
@@ -4980,6 +4982,7 @@
           <w:p>
             <w:pPr>
               <w:pStyle w:val="TableCell"/>
+              <w:keepNext/>
               <w:ind w:firstLine="0"/>
               <w:jc w:val="left"/>
             </w:pPr>
@@ -4995,6 +4998,7 @@
           <w:p>
             <w:pPr>
               <w:pStyle w:val="TableCell"/>
+              <w:keepNext/>
               <w:ind w:firstLine="0"/>
               <w:jc w:val="left"/>
             </w:pPr>
@@ -5010,6 +5014,7 @@
           <w:p>
             <w:pPr>
               <w:pStyle w:val="TableCell"/>
+              <w:keepNext/>
               <w:ind w:firstLine="0"/>
               <w:jc w:val="left"/>
             </w:pPr>
@@ -5025,11 +5030,410 @@
           <w:p>
             <w:pPr>
               <w:pStyle w:val="TableCell"/>
+              <w:keepNext/>
               <w:ind w:firstLine="0"/>
               <w:jc w:val="left"/>
             </w:pPr>
             <w:r>
               <w:t xml:space="preserve">表 VIII 最右欄；對這 5 個系統而言不是 hold-out 數字</w:t>
+            </w:r>
+          </w:p>
+        </w:tc>
+      </w:tr>
+      <w:tr>
+        <w:trPr>
+          <w:cantSplit/>
+        </w:trPr>
+        <w:tc>
+          <w:tcPr>
+            <w:tcW w:w="1250" w:type="dxa"/>
+          </w:tcPr>
+          <w:p>
+            <w:pPr>
+              <w:pStyle w:val="TableCell"/>
+              <w:keepNext/>
+              <w:ind w:firstLine="0"/>
+              <w:jc w:val="left"/>
+            </w:pPr>
+            <w:r>
+              <w:t xml:space="preserve">私有系統 AICS：零檔案</w:t>
+            </w:r>
+          </w:p>
+        </w:tc>
+        <w:tc>
+          <w:tcPr>
+            <w:tcW w:w="1050" w:type="dxa"/>
+          </w:tcPr>
+          <w:p>
+            <w:pPr>
+              <w:pStyle w:val="TableCell"/>
+              <w:keepNext/>
+              <w:ind w:firstLine="0"/>
+              <w:jc w:val="left"/>
+            </w:pPr>
+            <w:r>
+              <w:t xml:space="preserve">repo 網址＋元件清單</w:t>
+            </w:r>
+          </w:p>
+        </w:tc>
+        <w:tc>
+          <w:tcPr>
+            <w:tcW w:w="420" w:type="dxa"/>
+          </w:tcPr>
+          <w:p>
+            <w:pPr>
+              <w:pStyle w:val="TableCell"/>
+              <w:keepNext/>
+              <w:ind w:firstLine="0"/>
+              <w:jc w:val="left"/>
+            </w:pPr>
+            <w:r>
+              <w:t xml:space="preserve">0.52</w:t>
+            </w:r>
+          </w:p>
+        </w:tc>
+        <w:tc>
+          <w:tcPr>
+            <w:tcW w:w="420" w:type="dxa"/>
+          </w:tcPr>
+          <w:p>
+            <w:pPr>
+              <w:pStyle w:val="TableCell"/>
+              <w:keepNext/>
+              <w:ind w:firstLine="0"/>
+              <w:jc w:val="left"/>
+            </w:pPr>
+            <w:r>
+              <w:t xml:space="preserve">0.35</w:t>
+            </w:r>
+          </w:p>
+        </w:tc>
+        <w:tc>
+          <w:tcPr>
+            <w:tcW w:w="420" w:type="dxa"/>
+          </w:tcPr>
+          <w:p>
+            <w:pPr>
+              <w:pStyle w:val="TableCell"/>
+              <w:keepNext/>
+              <w:ind w:firstLine="0"/>
+              <w:jc w:val="left"/>
+            </w:pPr>
+            <w:r>
+              <w:t xml:space="preserve">0.42</w:t>
+            </w:r>
+          </w:p>
+        </w:tc>
+        <w:tc>
+          <w:tcPr>
+            <w:tcW w:w="1480" w:type="dxa"/>
+          </w:tcPr>
+          <w:p>
+            <w:pPr>
+              <w:pStyle w:val="TableCell"/>
+              <w:keepNext/>
+              <w:ind w:firstLine="0"/>
+              <w:jc w:val="left"/>
+            </w:pPr>
+            <w:r>
+              <w:t xml:space="preserve">畫對的幾乎都是從名稱就猜得到的邊（X-service → X-service-mongo、爬蟲 → 外部 API）；服務到服務的邊 P 0.21、R 0.20</w:t>
+            </w:r>
+          </w:p>
+        </w:tc>
+      </w:tr>
+      <w:tr>
+        <w:trPr>
+          <w:cantSplit/>
+        </w:trPr>
+        <w:tc>
+          <w:tcPr>
+            <w:tcW w:w="1250" w:type="dxa"/>
+          </w:tcPr>
+          <w:p>
+            <w:pPr>
+              <w:pStyle w:val="TableCell"/>
+              <w:keepNext/>
+              <w:ind w:firstLine="0"/>
+              <w:jc w:val="left"/>
+            </w:pPr>
+            <w:r>
+              <w:t xml:space="preserve">私有系統 AICS：給檔案</w:t>
+            </w:r>
+          </w:p>
+        </w:tc>
+        <w:tc>
+          <w:tcPr>
+            <w:tcW w:w="1050" w:type="dxa"/>
+          </w:tcPr>
+          <w:p>
+            <w:pPr>
+              <w:pStyle w:val="TableCell"/>
+              <w:keepNext/>
+              <w:ind w:firstLine="0"/>
+              <w:jc w:val="left"/>
+            </w:pPr>
+            <w:r>
+              <w:t xml:space="preserve">元件清單＋預算內檔案</w:t>
+            </w:r>
+          </w:p>
+        </w:tc>
+        <w:tc>
+          <w:tcPr>
+            <w:tcW w:w="420" w:type="dxa"/>
+          </w:tcPr>
+          <w:p>
+            <w:pPr>
+              <w:pStyle w:val="TableCell"/>
+              <w:keepNext/>
+              <w:ind w:firstLine="0"/>
+              <w:jc w:val="left"/>
+            </w:pPr>
+            <w:r>
+              <w:t xml:space="preserve">0.65</w:t>
+            </w:r>
+          </w:p>
+        </w:tc>
+        <w:tc>
+          <w:tcPr>
+            <w:tcW w:w="420" w:type="dxa"/>
+          </w:tcPr>
+          <w:p>
+            <w:pPr>
+              <w:pStyle w:val="TableCell"/>
+              <w:keepNext/>
+              <w:ind w:firstLine="0"/>
+              <w:jc w:val="left"/>
+            </w:pPr>
+            <w:r>
+              <w:t xml:space="preserve">0.56</w:t>
+            </w:r>
+          </w:p>
+        </w:tc>
+        <w:tc>
+          <w:tcPr>
+            <w:tcW w:w="420" w:type="dxa"/>
+          </w:tcPr>
+          <w:p>
+            <w:pPr>
+              <w:pStyle w:val="TableCell"/>
+              <w:keepNext/>
+              <w:ind w:firstLine="0"/>
+              <w:jc w:val="left"/>
+            </w:pPr>
+            <w:r>
+              <w:t xml:space="preserve">0.60</w:t>
+            </w:r>
+          </w:p>
+        </w:tc>
+        <w:tc>
+          <w:tcPr>
+            <w:tcW w:w="1480" w:type="dxa"/>
+          </w:tcPr>
+          <w:p>
+            <w:pPr>
+              <w:pStyle w:val="TableCell"/>
+              <w:keepNext/>
+              <w:ind w:firstLine="0"/>
+              <w:jc w:val="left"/>
+            </w:pPr>
+            <w:r>
+              <w:t xml:space="preserve">1 次輸出陷入迴圈（原始 565 條）；入口路由 6 條三次全漏</w:t>
+            </w:r>
+          </w:p>
+        </w:tc>
+      </w:tr>
+      <w:tr>
+        <w:trPr>
+          <w:cantSplit/>
+        </w:trPr>
+        <w:tc>
+          <w:tcPr>
+            <w:tcW w:w="1250" w:type="dxa"/>
+          </w:tcPr>
+          <w:p>
+            <w:pPr>
+              <w:pStyle w:val="TableCell"/>
+              <w:keepNext/>
+              <w:ind w:firstLine="0"/>
+              <w:jc w:val="left"/>
+            </w:pPr>
+            <w:r>
+              <w:t xml:space="preserve">私有系統 AICS：給檔案、不給名稱（嚴格對名）</w:t>
+            </w:r>
+          </w:p>
+        </w:tc>
+        <w:tc>
+          <w:tcPr>
+            <w:tcW w:w="1050" w:type="dxa"/>
+          </w:tcPr>
+          <w:p>
+            <w:pPr>
+              <w:pStyle w:val="TableCell"/>
+              <w:keepNext/>
+              <w:ind w:firstLine="0"/>
+              <w:jc w:val="left"/>
+            </w:pPr>
+            <w:r>
+              <w:t xml:space="preserve">預算內檔案</w:t>
+            </w:r>
+          </w:p>
+        </w:tc>
+        <w:tc>
+          <w:tcPr>
+            <w:tcW w:w="420" w:type="dxa"/>
+          </w:tcPr>
+          <w:p>
+            <w:pPr>
+              <w:pStyle w:val="TableCell"/>
+              <w:keepNext/>
+              <w:ind w:firstLine="0"/>
+              <w:jc w:val="left"/>
+            </w:pPr>
+            <w:r>
+              <w:t xml:space="preserve">0.57</w:t>
+            </w:r>
+          </w:p>
+        </w:tc>
+        <w:tc>
+          <w:tcPr>
+            <w:tcW w:w="420" w:type="dxa"/>
+          </w:tcPr>
+          <w:p>
+            <w:pPr>
+              <w:pStyle w:val="TableCell"/>
+              <w:keepNext/>
+              <w:ind w:firstLine="0"/>
+              <w:jc w:val="left"/>
+            </w:pPr>
+            <w:r>
+              <w:t xml:space="preserve">0.39</w:t>
+            </w:r>
+          </w:p>
+        </w:tc>
+        <w:tc>
+          <w:tcPr>
+            <w:tcW w:w="420" w:type="dxa"/>
+          </w:tcPr>
+          <w:p>
+            <w:pPr>
+              <w:pStyle w:val="TableCell"/>
+              <w:keepNext/>
+              <w:ind w:firstLine="0"/>
+              <w:jc w:val="left"/>
+            </w:pPr>
+            <w:r>
+              <w:t xml:space="preserve">0.46</w:t>
+            </w:r>
+          </w:p>
+        </w:tc>
+        <w:tc>
+          <w:tcPr>
+            <w:tcW w:w="1480" w:type="dxa"/>
+          </w:tcPr>
+          <w:p>
+            <w:pPr>
+              <w:pStyle w:val="TableCell"/>
+              <w:keepNext/>
+              <w:ind w:firstLine="0"/>
+              <w:jc w:val="left"/>
+            </w:pPr>
+            <w:r>
+              <w:t xml:space="preserve">polyrepo，名稱沒有單一來源</w:t>
+            </w:r>
+          </w:p>
+        </w:tc>
+      </w:tr>
+      <w:tr>
+        <w:trPr>
+          <w:cantSplit/>
+        </w:trPr>
+        <w:tc>
+          <w:tcPr>
+            <w:tcW w:w="1250" w:type="dxa"/>
+          </w:tcPr>
+          <w:p>
+            <w:pPr>
+              <w:pStyle w:val="TableCell"/>
+              <w:ind w:firstLine="0"/>
+              <w:jc w:val="left"/>
+            </w:pPr>
+            <w:r>
+              <w:t xml:space="preserve">私有系統 AICS：DepWeaver 靜態層（46 條）</w:t>
+            </w:r>
+          </w:p>
+        </w:tc>
+        <w:tc>
+          <w:tcPr>
+            <w:tcW w:w="1050" w:type="dxa"/>
+          </w:tcPr>
+          <w:p>
+            <w:pPr>
+              <w:pStyle w:val="TableCell"/>
+              <w:ind w:firstLine="0"/>
+              <w:jc w:val="left"/>
+            </w:pPr>
+            <w:r>
+              <w:t xml:space="preserve">不呼叫 LLM</w:t>
+            </w:r>
+          </w:p>
+        </w:tc>
+        <w:tc>
+          <w:tcPr>
+            <w:tcW w:w="420" w:type="dxa"/>
+          </w:tcPr>
+          <w:p>
+            <w:pPr>
+              <w:pStyle w:val="TableCell"/>
+              <w:ind w:firstLine="0"/>
+              <w:jc w:val="left"/>
+            </w:pPr>
+            <w:r>
+              <w:t xml:space="preserve">0.89</w:t>
+            </w:r>
+          </w:p>
+        </w:tc>
+        <w:tc>
+          <w:tcPr>
+            <w:tcW w:w="420" w:type="dxa"/>
+          </w:tcPr>
+          <w:p>
+            <w:pPr>
+              <w:pStyle w:val="TableCell"/>
+              <w:ind w:firstLine="0"/>
+              <w:jc w:val="left"/>
+            </w:pPr>
+            <w:r>
+              <w:t xml:space="preserve">0.63</w:t>
+            </w:r>
+          </w:p>
+        </w:tc>
+        <w:tc>
+          <w:tcPr>
+            <w:tcW w:w="420" w:type="dxa"/>
+          </w:tcPr>
+          <w:p>
+            <w:pPr>
+              <w:pStyle w:val="TableCell"/>
+              <w:ind w:firstLine="0"/>
+              <w:jc w:val="left"/>
+            </w:pPr>
+            <w:r>
+              <w:t xml:space="preserve">0.74</w:t>
+            </w:r>
+          </w:p>
+        </w:tc>
+        <w:tc>
+          <w:tcPr>
+            <w:tcW w:w="1480" w:type="dxa"/>
+          </w:tcPr>
+          <w:p>
+            <w:pPr>
+              <w:pStyle w:val="TableCell"/>
+              <w:ind w:firstLine="0"/>
+              <w:jc w:val="left"/>
+            </w:pPr>
+            <w:r>
+              <w:t xml:space="preserve">第 19 至 22 條在此歸納；漏的多是叢集外元件與經 SDK 的外部服務</w:t>
             </w:r>
           </w:p>
         </w:tc>
@@ -5053,7 +5457,7 @@
         <w:t xml:space="preserve">結果。</w:t>
       </w:r>
       <w:r>
-        <w:t xml:space="preserve">第一，不給事實時，LLM 畫不出正確的圖：零檔案組平均後沒有一個系統的 P 與 R 同時為 1.00。錯誤的型態有三種：套用別的系統的架構（robot-shop 把負載產生器畫成呼叫 6 個服務；TeaStore 把「全部裝在一個 pod」的部署變體畫成呼叫者）、資料庫接錯（Bank of Anthos 把 ledgerwriter 接到 accounts-db）、方向相反（piggymetrics 4 條）。這 7 個系統都公開在 GitHub 上、很可能在訓練資料裡，對私有系統這一組只會更差。第二，給了檔案之後，LLM 與當時的靜態層各有勝負：在靜態層 recall 較低的三個系統上它都較好（TeaStore 以 enum 常數指定目標的業務呼叫邊，LLM 3 次平均 recall 0.67（三次分別是 1.00、1.00、0.00），靜態層 0/7；ecommerce 只寫了 localhost 預設值的控制平面邊，0.81 對 0.28；robot-shop 的業務呼叫邊，1.00 對 0.40），但在 piggymetrics 較差（recall 0.71 對 1.00；3 次都遺漏的 7 條是 gateway 到 4 個服務、notification 與 statistics 到 auth-service 的業務呼叫邊，以及 turbine 到 rabbitmq）。第三，LLM 的輸出有三個分數看不出來的問題，而且都在這 63 次執行中出現：（i）沒有一條邊附出處，無法像 RQ1 那樣逐條查證；（ii）temperature 0 下同一個 prompt 三次結果不同（TeaStore 給檔案組 recall 0.46–1.00），Bank of Anthos 不給名稱組有兩次陷入迴圈，同樣 12 條邊重複輸出 1,417 次直到輸出上限；（iii）名稱由模型決定時，ecommerce 三次都用 Compose 的 container_name（user-service-container）而不是服務名，嚴格對名下 F1 為 0.00、寬鬆對名下為 0.96。分數的差距幾乎全部是名稱問題，而這正是第 III-F 節請操作者確認的問題。第四，事後逐條追查 LLM 贏過靜態層的那三個系統，靜態層輸的地方沒有一處是靜態分析的極限，都是規則缺口（第 IV-C 節的錯誤分析）；假想敵因此同時是找規則缺口的方法。第五，在 5 個 hold-out 系統上重複同一組對照（表 V 下半，45 次呼叫）：零檔案組 F1 只有 0.55，而且知名度越低越差（yas 0.37／0.29）；給檔案組 0.83，低於 7 個歸納用系統的 0.90，因為 yas 的 17 個模組加 Helm 與 Compose 超過預算、三次都只畫到一半（0.58／0.50）。LLM 唯一明顯勝過靜態層的是 hotelReservation（1.00 對 0.71）：它讀得懂 Go 程式碼裡的 Consul 名稱 srv-search 指的是 search，正是第 IV-C 節所說靜態層真正的邊界。</w:t>
+        <w:t xml:space="preserve">第一，不給事實時，LLM 畫不出正確的圖：零檔案組平均後沒有一個系統的 P 與 R 同時為 1.00。錯誤的型態有三種：套用別的系統的架構（robot-shop 把負載產生器畫成呼叫 6 個服務；TeaStore 把「全部裝在一個 pod」的部署變體畫成呼叫者）、資料庫接錯（Bank of Anthos 把 ledgerwriter 接到 accounts-db）、方向相反（piggymetrics 4 條）。這 7 個系統都公開在 GitHub 上、很可能在訓練資料裡，對私有系統這一組只會更差。第二，給了檔案之後，LLM 與當時的靜態層各有勝負：在靜態層 recall 較低的三個系統上它都較好（TeaStore 以 enum 常數指定目標的業務呼叫邊，LLM 3 次平均 recall 0.67（三次分別是 1.00、1.00、0.00），靜態層 0/7；ecommerce 只寫了 localhost 預設值的控制平面邊，0.81 對 0.28；robot-shop 的業務呼叫邊，1.00 對 0.40），但在 piggymetrics 較差（recall 0.71 對 1.00；3 次都遺漏的 7 條是 gateway 到 4 個服務、notification 與 statistics 到 auth-service 的業務呼叫邊，以及 turbine 到 rabbitmq）。第三，LLM 的輸出有三個分數看不出來的問題，而且都在這 63 次執行中出現：（i）沒有一條邊附出處，無法像 RQ1 那樣逐條查證；（ii）temperature 0 下同一個 prompt 三次結果不同（TeaStore 給檔案組 recall 0.46–1.00），Bank of Anthos 不給名稱組有兩次陷入迴圈，同樣 12 條邊重複輸出 1,417 次直到輸出上限；（iii）名稱由模型決定時，ecommerce 三次都用 Compose 的 container_name（user-service-container）而不是服務名，嚴格對名下 F1 為 0.00、寬鬆對名下為 0.96。分數的差距幾乎全部是名稱問題，而這正是第 III-F 節請操作者確認的問題。第四，事後逐條追查 LLM 贏過靜態層的那三個系統，靜態層輸的地方沒有一處是靜態分析的極限，都是規則缺口（第 IV-C 節的錯誤分析）；假想敵因此同時是找規則缺口的方法。第五，在 5 個 hold-out 系統上重複同一組對照（表 V 下半，45 次呼叫）：零檔案組 F1 只有 0.55，而且知名度越低越差（yas 0.37／0.29）；給檔案組 0.83，低於 7 個歸納用系統的 0.90，因為 yas 的 17 個模組加 Helm 與 Compose 超過預算、三次都只畫到一半（0.58／0.50）。LLM 唯一明顯勝過靜態層的是 hotelReservation（1.00 對 0.71）：它讀得懂 Go 程式碼裡的 Consul 名稱 srv-search 指的是 search，正是第 IV-C 節所說靜態層真正的邊界。第六，在不可能出現在訓練資料裡的私有系統 AICS 上（13 個 repo 的 polyrepo，Python），零檔案組 F1 0.42，而且畫對的幾乎都是從元件清單的名稱就猜得到的邊（服務到自己的資料庫、爬蟲到外部 API），服務到服務的呼叫 P 0.21、R 0.20：這是「不基於事實畫不出來」最直接的證據。給檔案組 0.60，仍低於靜態層的 0.74；三次都漏掉全部 6 條入口路由（Istio VirtualService）。</w:t>
       </w:r>
     </w:p>
     <w:p>
@@ -9363,7 +9767,7 @@
         <w:t xml:space="preserve">外部效度：</w:t>
       </w:r>
       <w:r>
-        <w:t xml:space="preserve">歸納用的系統以 Java 與 Spring 為主；hold-out 加入了 Go、.NET、Kotlin、Rust 等語言，但這些語言只有薄表面抽取。含缺口補齊的完整執行期驗證只有 Bank of Anthos 一個案例。RQ0 的假想敵在 7 個歸納用系統與 5 個 hold-out 系統上各執行一次，但 hold-out 那一組比較的是第三輪規則後的靜態層。</w:t>
+        <w:t xml:space="preserve">歸納用的系統以 Java 與 Spring 為主；hold-out 加入了 Go、.NET、Kotlin、Rust 等語言，但這些語言只有薄表面抽取。含缺口補齊的完整執行期驗證只有 Bank of Anthos 一個案例。RQ0 的假想敵在 7 個歸納用系統、5 個 hold-out 系統與 1 個私有系統上各執行一次，但後兩組比較的是第三輪規則後的靜態層；私有系統的結果只報告總分。</w:t>
       </w:r>
       <w:r>
         <w:rPr>

</xml_diff>

<commit_message>
feat(trace): per-rule trigger counts across 20 systems; hold-out D baseline
RuleTrace records every point where one of the 46 rules changes an
outcome; GreenfieldProbeTest emits a 規則觸發 section and <name>.rules.json.
docs/generalization/rule-triggers.md: 20 rules fire on ≥5 systems,
15 on 2–4 (each on at least one non-inducing system), 10 only where
induced (7 tied to single-occurrence technologies), 1 never (rule 26).
Appendix table gains "systems fired / hits" columns.

Hold-out D (kiali travels, apache skywalking-showcase) truth sets and
round-3 baseline: travels 1.00/0.84 (full transfer), skywalking 0.08/0.25
(Helm templates unreadable, image-name aliases, network aliases, command:).

Co-Authored-By: Claude Fable 5.1 <noreply@anthropic.com>
</commit_message>
<xml_diff>
--- a/docs/papers/compsac-2027-zh.docx
+++ b/docs/papers/compsac-2027-zh.docx
@@ -9819,7 +9819,7 @@
         <w:pStyle w:val="BodyText"/>
       </w:pPr>
       <w:r>
-        <w:t xml:space="preserve">表 X 是第 III-D 節所述規則的全表（第 1 至 14 條為初稿時的規則，第 15 至 23 條為第二輪新增，第 24 至 35 條為三個 hold-out 系統逼出的第三輪，第 36 至 46 條為第二組 hold-out 兩個系統逼出的第四輪）。每一條都是在某個受測系統上追查差異時歸納出來的，沒有一條寫死專案名；「觸發」欄是第一次逼出這條規則的系統，「位置」欄是實作它的元件。</w:t>
+        <w:t xml:space="preserve">表 X 是第 III-D 節所述規則的全表（第 1 至 14 條為初稿時的規則，第 15 至 23 條為第二輪新增，第 24 至 35 條為三個 hold-out 系統逼出的第三輪，第 36 至 46 條為第二組 hold-out 兩個系統逼出的第四輪）。每一條都是在某個受測系統上追查差異時歸納出來的，沒有一條寫死專案名；「觸發」欄是第一次逼出這條規則的系統，「位置」欄是實作它的元件。最後兩欄回答「這是不是把例子列舉一遍」：靜態層在每條規則改變結果的地方（畫出、不畫或改等級一條邊，建立、合併或壓掉一個節點，解開一個名稱；純解析的規則數它解析的檔案）留下記錄，把規則 1 至 46 原封不動地跑在全部 20 個系統上，「系統數」是這條規則至少改變一次結果的系統數（robot-shop 的兩個 checkout 算一個），「命中」是它在 20 個系統上改變的不同事物的總數。46 條中有 20 條在 5 個以上的系統上觸發、15 條在 2 至 4 個、10 條只在歸納它的那個系統上觸發（其中 7 條綁在只出現一次的技術上：Kotlin、Envoy、YARP、.NET 連線字串、nginx 變數、SOAP 命名空間、Python 套件庫）、1 條（第 26 條）從未觸發——它說的連線 scheme 在 20 個系統上都與主機名稱的判定一致，在歸納它的 mall-swarm 上第 25 條先解開了別名，它成了從未用到的保險。</w:t>
       </w:r>
     </w:p>
     <w:p>
@@ -9848,9 +9848,11 @@
       </w:tblPr>
       <w:tblGrid>
         <w:gridCol w:w="300"/>
-        <w:gridCol w:w="2900"/>
-        <w:gridCol w:w="1200"/>
+        <w:gridCol w:w="2300"/>
+        <w:gridCol w:w="1000"/>
         <w:gridCol w:w="640"/>
+        <w:gridCol w:w="400"/>
+        <w:gridCol w:w="400"/>
       </w:tblGrid>
       <w:tr>
         <w:trPr>
@@ -9882,7 +9884,7 @@
         </w:tc>
         <w:tc>
           <w:tcPr>
-            <w:tcW w:w="2900" w:type="dxa"/>
+            <w:tcW w:w="2300" w:type="dxa"/>
             <w:tcBorders>
               <w:bottom w:val="single" w:sz="4" w:space="0" w:color="000000"/>
             </w:tcBorders>
@@ -9905,7 +9907,7 @@
         </w:tc>
         <w:tc>
           <w:tcPr>
-            <w:tcW w:w="1200" w:type="dxa"/>
+            <w:tcW w:w="1000" w:type="dxa"/>
             <w:tcBorders>
               <w:bottom w:val="single" w:sz="4" w:space="0" w:color="000000"/>
             </w:tcBorders>
@@ -9949,6 +9951,52 @@
             </w:r>
           </w:p>
         </w:tc>
+        <w:tc>
+          <w:tcPr>
+            <w:tcW w:w="400" w:type="dxa"/>
+            <w:tcBorders>
+              <w:bottom w:val="single" w:sz="4" w:space="0" w:color="000000"/>
+            </w:tcBorders>
+          </w:tcPr>
+          <w:p>
+            <w:pPr>
+              <w:pStyle w:val="TableCell"/>
+              <w:keepNext/>
+              <w:ind w:firstLine="0"/>
+              <w:jc w:val="left"/>
+            </w:pPr>
+            <w:r>
+              <w:rPr>
+                <w:b/>
+                <w:bCs/>
+              </w:rPr>
+              <w:t xml:space="preserve">系統數</w:t>
+            </w:r>
+          </w:p>
+        </w:tc>
+        <w:tc>
+          <w:tcPr>
+            <w:tcW w:w="400" w:type="dxa"/>
+            <w:tcBorders>
+              <w:bottom w:val="single" w:sz="4" w:space="0" w:color="000000"/>
+            </w:tcBorders>
+          </w:tcPr>
+          <w:p>
+            <w:pPr>
+              <w:pStyle w:val="TableCell"/>
+              <w:keepNext/>
+              <w:ind w:firstLine="0"/>
+              <w:jc w:val="left"/>
+            </w:pPr>
+            <w:r>
+              <w:rPr>
+                <w:b/>
+                <w:bCs/>
+              </w:rPr>
+              <w:t xml:space="preserve">命中</w:t>
+            </w:r>
+          </w:p>
+        </w:tc>
       </w:tr>
       <w:tr>
         <w:trPr>
@@ -9972,7 +10020,7 @@
         </w:tc>
         <w:tc>
           <w:tcPr>
-            <w:tcW w:w="2900" w:type="dxa"/>
+            <w:tcW w:w="2300" w:type="dxa"/>
           </w:tcPr>
           <w:p>
             <w:pPr>
@@ -9988,7 +10036,7 @@
         </w:tc>
         <w:tc>
           <w:tcPr>
-            <w:tcW w:w="1200" w:type="dxa"/>
+            <w:tcW w:w="1000" w:type="dxa"/>
           </w:tcPr>
           <w:p>
             <w:pPr>
@@ -10015,6 +10063,38 @@
             </w:pPr>
             <w:r>
               <w:t xml:space="preserve">ConfigExtractor、CodeGraphMerger</w:t>
+            </w:r>
+          </w:p>
+        </w:tc>
+        <w:tc>
+          <w:tcPr>
+            <w:tcW w:w="400" w:type="dxa"/>
+          </w:tcPr>
+          <w:p>
+            <w:pPr>
+              <w:pStyle w:val="TableCell"/>
+              <w:keepNext/>
+              <w:ind w:firstLine="0"/>
+              <w:jc w:val="left"/>
+            </w:pPr>
+            <w:r>
+              <w:t xml:space="preserve">9</w:t>
+            </w:r>
+          </w:p>
+        </w:tc>
+        <w:tc>
+          <w:tcPr>
+            <w:tcW w:w="400" w:type="dxa"/>
+          </w:tcPr>
+          <w:p>
+            <w:pPr>
+              <w:pStyle w:val="TableCell"/>
+              <w:keepNext/>
+              <w:ind w:firstLine="0"/>
+              <w:jc w:val="left"/>
+            </w:pPr>
+            <w:r>
+              <w:t xml:space="preserve">206</w:t>
             </w:r>
           </w:p>
         </w:tc>
@@ -10041,7 +10121,7 @@
         </w:tc>
         <w:tc>
           <w:tcPr>
-            <w:tcW w:w="2900" w:type="dxa"/>
+            <w:tcW w:w="2300" w:type="dxa"/>
           </w:tcPr>
           <w:p>
             <w:pPr>
@@ -10057,7 +10137,7 @@
         </w:tc>
         <w:tc>
           <w:tcPr>
-            <w:tcW w:w="1200" w:type="dxa"/>
+            <w:tcW w:w="1000" w:type="dxa"/>
           </w:tcPr>
           <w:p>
             <w:pPr>
@@ -10084,6 +10164,38 @@
             </w:pPr>
             <w:r>
               <w:t xml:space="preserve">ServiceRootScanner</w:t>
+            </w:r>
+          </w:p>
+        </w:tc>
+        <w:tc>
+          <w:tcPr>
+            <w:tcW w:w="400" w:type="dxa"/>
+          </w:tcPr>
+          <w:p>
+            <w:pPr>
+              <w:pStyle w:val="TableCell"/>
+              <w:keepNext/>
+              <w:ind w:firstLine="0"/>
+              <w:jc w:val="left"/>
+            </w:pPr>
+            <w:r>
+              <w:t xml:space="preserve">11</w:t>
+            </w:r>
+          </w:p>
+        </w:tc>
+        <w:tc>
+          <w:tcPr>
+            <w:tcW w:w="400" w:type="dxa"/>
+          </w:tcPr>
+          <w:p>
+            <w:pPr>
+              <w:pStyle w:val="TableCell"/>
+              <w:keepNext/>
+              <w:ind w:firstLine="0"/>
+              <w:jc w:val="left"/>
+            </w:pPr>
+            <w:r>
+              <w:t xml:space="preserve">75</w:t>
             </w:r>
           </w:p>
         </w:tc>
@@ -10110,7 +10222,7 @@
         </w:tc>
         <w:tc>
           <w:tcPr>
-            <w:tcW w:w="2900" w:type="dxa"/>
+            <w:tcW w:w="2300" w:type="dxa"/>
           </w:tcPr>
           <w:p>
             <w:pPr>
@@ -10126,7 +10238,7 @@
         </w:tc>
         <w:tc>
           <w:tcPr>
-            <w:tcW w:w="1200" w:type="dxa"/>
+            <w:tcW w:w="1000" w:type="dxa"/>
           </w:tcPr>
           <w:p>
             <w:pPr>
@@ -10153,6 +10265,38 @@
             </w:pPr>
             <w:r>
               <w:t xml:space="preserve">ConfigExtractor、CodeGraphMerger</w:t>
+            </w:r>
+          </w:p>
+        </w:tc>
+        <w:tc>
+          <w:tcPr>
+            <w:tcW w:w="400" w:type="dxa"/>
+          </w:tcPr>
+          <w:p>
+            <w:pPr>
+              <w:pStyle w:val="TableCell"/>
+              <w:keepNext/>
+              <w:ind w:firstLine="0"/>
+              <w:jc w:val="left"/>
+            </w:pPr>
+            <w:r>
+              <w:t xml:space="preserve">5</w:t>
+            </w:r>
+          </w:p>
+        </w:tc>
+        <w:tc>
+          <w:tcPr>
+            <w:tcW w:w="400" w:type="dxa"/>
+          </w:tcPr>
+          <w:p>
+            <w:pPr>
+              <w:pStyle w:val="TableCell"/>
+              <w:keepNext/>
+              <w:ind w:firstLine="0"/>
+              <w:jc w:val="left"/>
+            </w:pPr>
+            <w:r>
+              <w:t xml:space="preserve">84</w:t>
             </w:r>
           </w:p>
         </w:tc>
@@ -10179,7 +10323,7 @@
         </w:tc>
         <w:tc>
           <w:tcPr>
-            <w:tcW w:w="2900" w:type="dxa"/>
+            <w:tcW w:w="2300" w:type="dxa"/>
           </w:tcPr>
           <w:p>
             <w:pPr>
@@ -10195,7 +10339,7 @@
         </w:tc>
         <w:tc>
           <w:tcPr>
-            <w:tcW w:w="1200" w:type="dxa"/>
+            <w:tcW w:w="1000" w:type="dxa"/>
           </w:tcPr>
           <w:p>
             <w:pPr>
@@ -10222,6 +10366,38 @@
             </w:pPr>
             <w:r>
               <w:t xml:space="preserve">CodeGraphMerger</w:t>
+            </w:r>
+          </w:p>
+        </w:tc>
+        <w:tc>
+          <w:tcPr>
+            <w:tcW w:w="400" w:type="dxa"/>
+          </w:tcPr>
+          <w:p>
+            <w:pPr>
+              <w:pStyle w:val="TableCell"/>
+              <w:keepNext/>
+              <w:ind w:firstLine="0"/>
+              <w:jc w:val="left"/>
+            </w:pPr>
+            <w:r>
+              <w:t xml:space="preserve">12</w:t>
+            </w:r>
+          </w:p>
+        </w:tc>
+        <w:tc>
+          <w:tcPr>
+            <w:tcW w:w="400" w:type="dxa"/>
+          </w:tcPr>
+          <w:p>
+            <w:pPr>
+              <w:pStyle w:val="TableCell"/>
+              <w:keepNext/>
+              <w:ind w:firstLine="0"/>
+              <w:jc w:val="left"/>
+            </w:pPr>
+            <w:r>
+              <w:t xml:space="preserve">167</w:t>
             </w:r>
           </w:p>
         </w:tc>
@@ -10248,7 +10424,7 @@
         </w:tc>
         <w:tc>
           <w:tcPr>
-            <w:tcW w:w="2900" w:type="dxa"/>
+            <w:tcW w:w="2300" w:type="dxa"/>
           </w:tcPr>
           <w:p>
             <w:pPr>
@@ -10264,7 +10440,7 @@
         </w:tc>
         <w:tc>
           <w:tcPr>
-            <w:tcW w:w="1200" w:type="dxa"/>
+            <w:tcW w:w="1000" w:type="dxa"/>
           </w:tcPr>
           <w:p>
             <w:pPr>
@@ -10291,6 +10467,38 @@
             </w:pPr>
             <w:r>
               <w:t xml:space="preserve">ConfigExtractor</w:t>
+            </w:r>
+          </w:p>
+        </w:tc>
+        <w:tc>
+          <w:tcPr>
+            <w:tcW w:w="400" w:type="dxa"/>
+          </w:tcPr>
+          <w:p>
+            <w:pPr>
+              <w:pStyle w:val="TableCell"/>
+              <w:keepNext/>
+              <w:ind w:firstLine="0"/>
+              <w:jc w:val="left"/>
+            </w:pPr>
+            <w:r>
+              <w:t xml:space="preserve">10</w:t>
+            </w:r>
+          </w:p>
+        </w:tc>
+        <w:tc>
+          <w:tcPr>
+            <w:tcW w:w="400" w:type="dxa"/>
+          </w:tcPr>
+          <w:p>
+            <w:pPr>
+              <w:pStyle w:val="TableCell"/>
+              <w:keepNext/>
+              <w:ind w:firstLine="0"/>
+              <w:jc w:val="left"/>
+            </w:pPr>
+            <w:r>
+              <w:t xml:space="preserve">102</w:t>
             </w:r>
           </w:p>
         </w:tc>
@@ -10317,7 +10525,7 @@
         </w:tc>
         <w:tc>
           <w:tcPr>
-            <w:tcW w:w="2900" w:type="dxa"/>
+            <w:tcW w:w="2300" w:type="dxa"/>
           </w:tcPr>
           <w:p>
             <w:pPr>
@@ -10333,7 +10541,7 @@
         </w:tc>
         <w:tc>
           <w:tcPr>
-            <w:tcW w:w="1200" w:type="dxa"/>
+            <w:tcW w:w="1000" w:type="dxa"/>
           </w:tcPr>
           <w:p>
             <w:pPr>
@@ -10360,6 +10568,38 @@
             </w:pPr>
             <w:r>
               <w:t xml:space="preserve">ConfigExtractor</w:t>
+            </w:r>
+          </w:p>
+        </w:tc>
+        <w:tc>
+          <w:tcPr>
+            <w:tcW w:w="400" w:type="dxa"/>
+          </w:tcPr>
+          <w:p>
+            <w:pPr>
+              <w:pStyle w:val="TableCell"/>
+              <w:keepNext/>
+              <w:ind w:firstLine="0"/>
+              <w:jc w:val="left"/>
+            </w:pPr>
+            <w:r>
+              <w:t xml:space="preserve">5</w:t>
+            </w:r>
+          </w:p>
+        </w:tc>
+        <w:tc>
+          <w:tcPr>
+            <w:tcW w:w="400" w:type="dxa"/>
+          </w:tcPr>
+          <w:p>
+            <w:pPr>
+              <w:pStyle w:val="TableCell"/>
+              <w:keepNext/>
+              <w:ind w:firstLine="0"/>
+              <w:jc w:val="left"/>
+            </w:pPr>
+            <w:r>
+              <w:t xml:space="preserve">40</w:t>
             </w:r>
           </w:p>
         </w:tc>
@@ -10386,7 +10626,7 @@
         </w:tc>
         <w:tc>
           <w:tcPr>
-            <w:tcW w:w="2900" w:type="dxa"/>
+            <w:tcW w:w="2300" w:type="dxa"/>
           </w:tcPr>
           <w:p>
             <w:pPr>
@@ -10402,7 +10642,7 @@
         </w:tc>
         <w:tc>
           <w:tcPr>
-            <w:tcW w:w="1200" w:type="dxa"/>
+            <w:tcW w:w="1000" w:type="dxa"/>
           </w:tcPr>
           <w:p>
             <w:pPr>
@@ -10429,6 +10669,38 @@
             </w:pPr>
             <w:r>
               <w:t xml:space="preserve">ConfigExtractor、CodeGraphMerger</w:t>
+            </w:r>
+          </w:p>
+        </w:tc>
+        <w:tc>
+          <w:tcPr>
+            <w:tcW w:w="400" w:type="dxa"/>
+          </w:tcPr>
+          <w:p>
+            <w:pPr>
+              <w:pStyle w:val="TableCell"/>
+              <w:keepNext/>
+              <w:ind w:firstLine="0"/>
+              <w:jc w:val="left"/>
+            </w:pPr>
+            <w:r>
+              <w:t xml:space="preserve">9</w:t>
+            </w:r>
+          </w:p>
+        </w:tc>
+        <w:tc>
+          <w:tcPr>
+            <w:tcW w:w="400" w:type="dxa"/>
+          </w:tcPr>
+          <w:p>
+            <w:pPr>
+              <w:pStyle w:val="TableCell"/>
+              <w:keepNext/>
+              <w:ind w:firstLine="0"/>
+              <w:jc w:val="left"/>
+            </w:pPr>
+            <w:r>
+              <w:t xml:space="preserve">92</w:t>
             </w:r>
           </w:p>
         </w:tc>
@@ -10455,7 +10727,7 @@
         </w:tc>
         <w:tc>
           <w:tcPr>
-            <w:tcW w:w="2900" w:type="dxa"/>
+            <w:tcW w:w="2300" w:type="dxa"/>
           </w:tcPr>
           <w:p>
             <w:pPr>
@@ -10471,7 +10743,7 @@
         </w:tc>
         <w:tc>
           <w:tcPr>
-            <w:tcW w:w="1200" w:type="dxa"/>
+            <w:tcW w:w="1000" w:type="dxa"/>
           </w:tcPr>
           <w:p>
             <w:pPr>
@@ -10498,6 +10770,38 @@
             </w:pPr>
             <w:r>
               <w:t xml:space="preserve">CodeGraphMerger</w:t>
+            </w:r>
+          </w:p>
+        </w:tc>
+        <w:tc>
+          <w:tcPr>
+            <w:tcW w:w="400" w:type="dxa"/>
+          </w:tcPr>
+          <w:p>
+            <w:pPr>
+              <w:pStyle w:val="TableCell"/>
+              <w:keepNext/>
+              <w:ind w:firstLine="0"/>
+              <w:jc w:val="left"/>
+            </w:pPr>
+            <w:r>
+              <w:t xml:space="preserve">14</w:t>
+            </w:r>
+          </w:p>
+        </w:tc>
+        <w:tc>
+          <w:tcPr>
+            <w:tcW w:w="400" w:type="dxa"/>
+          </w:tcPr>
+          <w:p>
+            <w:pPr>
+              <w:pStyle w:val="TableCell"/>
+              <w:keepNext/>
+              <w:ind w:firstLine="0"/>
+              <w:jc w:val="left"/>
+            </w:pPr>
+            <w:r>
+              <w:t xml:space="preserve">147</w:t>
             </w:r>
           </w:p>
         </w:tc>
@@ -10524,7 +10828,7 @@
         </w:tc>
         <w:tc>
           <w:tcPr>
-            <w:tcW w:w="2900" w:type="dxa"/>
+            <w:tcW w:w="2300" w:type="dxa"/>
           </w:tcPr>
           <w:p>
             <w:pPr>
@@ -10540,7 +10844,7 @@
         </w:tc>
         <w:tc>
           <w:tcPr>
-            <w:tcW w:w="1200" w:type="dxa"/>
+            <w:tcW w:w="1000" w:type="dxa"/>
           </w:tcPr>
           <w:p>
             <w:pPr>
@@ -10567,6 +10871,38 @@
             </w:pPr>
             <w:r>
               <w:t xml:space="preserve">TreeSitterExtractor、查詢檔</w:t>
+            </w:r>
+          </w:p>
+        </w:tc>
+        <w:tc>
+          <w:tcPr>
+            <w:tcW w:w="400" w:type="dxa"/>
+          </w:tcPr>
+          <w:p>
+            <w:pPr>
+              <w:pStyle w:val="TableCell"/>
+              <w:keepNext/>
+              <w:ind w:firstLine="0"/>
+              <w:jc w:val="left"/>
+            </w:pPr>
+            <w:r>
+              <w:t xml:space="preserve">14</w:t>
+            </w:r>
+          </w:p>
+        </w:tc>
+        <w:tc>
+          <w:tcPr>
+            <w:tcW w:w="400" w:type="dxa"/>
+          </w:tcPr>
+          <w:p>
+            <w:pPr>
+              <w:pStyle w:val="TableCell"/>
+              <w:keepNext/>
+              <w:ind w:firstLine="0"/>
+              <w:jc w:val="left"/>
+            </w:pPr>
+            <w:r>
+              <w:t xml:space="preserve">279</w:t>
             </w:r>
           </w:p>
         </w:tc>
@@ -10593,7 +10929,7 @@
         </w:tc>
         <w:tc>
           <w:tcPr>
-            <w:tcW w:w="2900" w:type="dxa"/>
+            <w:tcW w:w="2300" w:type="dxa"/>
           </w:tcPr>
           <w:p>
             <w:pPr>
@@ -10609,7 +10945,7 @@
         </w:tc>
         <w:tc>
           <w:tcPr>
-            <w:tcW w:w="1200" w:type="dxa"/>
+            <w:tcW w:w="1000" w:type="dxa"/>
           </w:tcPr>
           <w:p>
             <w:pPr>
@@ -10636,6 +10972,38 @@
             </w:pPr>
             <w:r>
               <w:t xml:space="preserve">ConfigExtractor</w:t>
+            </w:r>
+          </w:p>
+        </w:tc>
+        <w:tc>
+          <w:tcPr>
+            <w:tcW w:w="400" w:type="dxa"/>
+          </w:tcPr>
+          <w:p>
+            <w:pPr>
+              <w:pStyle w:val="TableCell"/>
+              <w:keepNext/>
+              <w:ind w:firstLine="0"/>
+              <w:jc w:val="left"/>
+            </w:pPr>
+            <w:r>
+              <w:t xml:space="preserve">9</w:t>
+            </w:r>
+          </w:p>
+        </w:tc>
+        <w:tc>
+          <w:tcPr>
+            <w:tcW w:w="400" w:type="dxa"/>
+          </w:tcPr>
+          <w:p>
+            <w:pPr>
+              <w:pStyle w:val="TableCell"/>
+              <w:keepNext/>
+              <w:ind w:firstLine="0"/>
+              <w:jc w:val="left"/>
+            </w:pPr>
+            <w:r>
+              <w:t xml:space="preserve">108</w:t>
             </w:r>
           </w:p>
         </w:tc>
@@ -10662,7 +11030,7 @@
         </w:tc>
         <w:tc>
           <w:tcPr>
-            <w:tcW w:w="2900" w:type="dxa"/>
+            <w:tcW w:w="2300" w:type="dxa"/>
           </w:tcPr>
           <w:p>
             <w:pPr>
@@ -10678,7 +11046,7 @@
         </w:tc>
         <w:tc>
           <w:tcPr>
-            <w:tcW w:w="1200" w:type="dxa"/>
+            <w:tcW w:w="1000" w:type="dxa"/>
           </w:tcPr>
           <w:p>
             <w:pPr>
@@ -10705,6 +11073,38 @@
             </w:pPr>
             <w:r>
               <w:t xml:space="preserve">ConfigExtractor、CodeGraphMerger</w:t>
+            </w:r>
+          </w:p>
+        </w:tc>
+        <w:tc>
+          <w:tcPr>
+            <w:tcW w:w="400" w:type="dxa"/>
+          </w:tcPr>
+          <w:p>
+            <w:pPr>
+              <w:pStyle w:val="TableCell"/>
+              <w:keepNext/>
+              <w:ind w:firstLine="0"/>
+              <w:jc w:val="left"/>
+            </w:pPr>
+            <w:r>
+              <w:t xml:space="preserve">14</w:t>
+            </w:r>
+          </w:p>
+        </w:tc>
+        <w:tc>
+          <w:tcPr>
+            <w:tcW w:w="400" w:type="dxa"/>
+          </w:tcPr>
+          <w:p>
+            <w:pPr>
+              <w:pStyle w:val="TableCell"/>
+              <w:keepNext/>
+              <w:ind w:firstLine="0"/>
+              <w:jc w:val="left"/>
+            </w:pPr>
+            <w:r>
+              <w:t xml:space="preserve">132</w:t>
             </w:r>
           </w:p>
         </w:tc>
@@ -10731,7 +11131,7 @@
         </w:tc>
         <w:tc>
           <w:tcPr>
-            <w:tcW w:w="2900" w:type="dxa"/>
+            <w:tcW w:w="2300" w:type="dxa"/>
           </w:tcPr>
           <w:p>
             <w:pPr>
@@ -10747,7 +11147,7 @@
         </w:tc>
         <w:tc>
           <w:tcPr>
-            <w:tcW w:w="1200" w:type="dxa"/>
+            <w:tcW w:w="1000" w:type="dxa"/>
           </w:tcPr>
           <w:p>
             <w:pPr>
@@ -10774,6 +11174,38 @@
             </w:pPr>
             <w:r>
               <w:t xml:space="preserve">ConfigExtractor</w:t>
+            </w:r>
+          </w:p>
+        </w:tc>
+        <w:tc>
+          <w:tcPr>
+            <w:tcW w:w="400" w:type="dxa"/>
+          </w:tcPr>
+          <w:p>
+            <w:pPr>
+              <w:pStyle w:val="TableCell"/>
+              <w:keepNext/>
+              <w:ind w:firstLine="0"/>
+              <w:jc w:val="left"/>
+            </w:pPr>
+            <w:r>
+              <w:t xml:space="preserve">6</w:t>
+            </w:r>
+          </w:p>
+        </w:tc>
+        <w:tc>
+          <w:tcPr>
+            <w:tcW w:w="400" w:type="dxa"/>
+          </w:tcPr>
+          <w:p>
+            <w:pPr>
+              <w:pStyle w:val="TableCell"/>
+              <w:keepNext/>
+              <w:ind w:firstLine="0"/>
+              <w:jc w:val="left"/>
+            </w:pPr>
+            <w:r>
+              <w:t xml:space="preserve">82</w:t>
             </w:r>
           </w:p>
         </w:tc>
@@ -10800,7 +11232,7 @@
         </w:tc>
         <w:tc>
           <w:tcPr>
-            <w:tcW w:w="2900" w:type="dxa"/>
+            <w:tcW w:w="2300" w:type="dxa"/>
           </w:tcPr>
           <w:p>
             <w:pPr>
@@ -10816,7 +11248,7 @@
         </w:tc>
         <w:tc>
           <w:tcPr>
-            <w:tcW w:w="1200" w:type="dxa"/>
+            <w:tcW w:w="1000" w:type="dxa"/>
           </w:tcPr>
           <w:p>
             <w:pPr>
@@ -10843,6 +11275,38 @@
             </w:pPr>
             <w:r>
               <w:t xml:space="preserve">TreeSitterExtractor</w:t>
+            </w:r>
+          </w:p>
+        </w:tc>
+        <w:tc>
+          <w:tcPr>
+            <w:tcW w:w="400" w:type="dxa"/>
+          </w:tcPr>
+          <w:p>
+            <w:pPr>
+              <w:pStyle w:val="TableCell"/>
+              <w:keepNext/>
+              <w:ind w:firstLine="0"/>
+              <w:jc w:val="left"/>
+            </w:pPr>
+            <w:r>
+              <w:t xml:space="preserve">1</w:t>
+            </w:r>
+          </w:p>
+        </w:tc>
+        <w:tc>
+          <w:tcPr>
+            <w:tcW w:w="400" w:type="dxa"/>
+          </w:tcPr>
+          <w:p>
+            <w:pPr>
+              <w:pStyle w:val="TableCell"/>
+              <w:keepNext/>
+              <w:ind w:firstLine="0"/>
+              <w:jc w:val="left"/>
+            </w:pPr>
+            <w:r>
+              <w:t xml:space="preserve">3</w:t>
             </w:r>
           </w:p>
         </w:tc>
@@ -10869,7 +11333,7 @@
         </w:tc>
         <w:tc>
           <w:tcPr>
-            <w:tcW w:w="2900" w:type="dxa"/>
+            <w:tcW w:w="2300" w:type="dxa"/>
           </w:tcPr>
           <w:p>
             <w:pPr>
@@ -10885,7 +11349,7 @@
         </w:tc>
         <w:tc>
           <w:tcPr>
-            <w:tcW w:w="1200" w:type="dxa"/>
+            <w:tcW w:w="1000" w:type="dxa"/>
           </w:tcPr>
           <w:p>
             <w:pPr>
@@ -10912,6 +11376,38 @@
             </w:pPr>
             <w:r>
               <w:t xml:space="preserve">CodeGraphMerger</w:t>
+            </w:r>
+          </w:p>
+        </w:tc>
+        <w:tc>
+          <w:tcPr>
+            <w:tcW w:w="400" w:type="dxa"/>
+          </w:tcPr>
+          <w:p>
+            <w:pPr>
+              <w:pStyle w:val="TableCell"/>
+              <w:keepNext/>
+              <w:ind w:firstLine="0"/>
+              <w:jc w:val="left"/>
+            </w:pPr>
+            <w:r>
+              <w:t xml:space="preserve">9</w:t>
+            </w:r>
+          </w:p>
+        </w:tc>
+        <w:tc>
+          <w:tcPr>
+            <w:tcW w:w="400" w:type="dxa"/>
+          </w:tcPr>
+          <w:p>
+            <w:pPr>
+              <w:pStyle w:val="TableCell"/>
+              <w:keepNext/>
+              <w:ind w:firstLine="0"/>
+              <w:jc w:val="left"/>
+            </w:pPr>
+            <w:r>
+              <w:t xml:space="preserve">220</w:t>
             </w:r>
           </w:p>
         </w:tc>
@@ -10938,7 +11434,7 @@
         </w:tc>
         <w:tc>
           <w:tcPr>
-            <w:tcW w:w="2900" w:type="dxa"/>
+            <w:tcW w:w="2300" w:type="dxa"/>
           </w:tcPr>
           <w:p>
             <w:pPr>
@@ -10954,7 +11450,7 @@
         </w:tc>
         <w:tc>
           <w:tcPr>
-            <w:tcW w:w="1200" w:type="dxa"/>
+            <w:tcW w:w="1000" w:type="dxa"/>
           </w:tcPr>
           <w:p>
             <w:pPr>
@@ -10981,6 +11477,38 @@
             </w:pPr>
             <w:r>
               <w:t xml:space="preserve">ConfigExtractor、CodeGraphMerger</w:t>
+            </w:r>
+          </w:p>
+        </w:tc>
+        <w:tc>
+          <w:tcPr>
+            <w:tcW w:w="400" w:type="dxa"/>
+          </w:tcPr>
+          <w:p>
+            <w:pPr>
+              <w:pStyle w:val="TableCell"/>
+              <w:keepNext/>
+              <w:ind w:firstLine="0"/>
+              <w:jc w:val="left"/>
+            </w:pPr>
+            <w:r>
+              <w:t xml:space="preserve">5</w:t>
+            </w:r>
+          </w:p>
+        </w:tc>
+        <w:tc>
+          <w:tcPr>
+            <w:tcW w:w="400" w:type="dxa"/>
+          </w:tcPr>
+          <w:p>
+            <w:pPr>
+              <w:pStyle w:val="TableCell"/>
+              <w:keepNext/>
+              <w:ind w:firstLine="0"/>
+              <w:jc w:val="left"/>
+            </w:pPr>
+            <w:r>
+              <w:t xml:space="preserve">48</w:t>
             </w:r>
           </w:p>
         </w:tc>
@@ -11007,7 +11535,7 @@
         </w:tc>
         <w:tc>
           <w:tcPr>
-            <w:tcW w:w="2900" w:type="dxa"/>
+            <w:tcW w:w="2300" w:type="dxa"/>
           </w:tcPr>
           <w:p>
             <w:pPr>
@@ -11023,7 +11551,7 @@
         </w:tc>
         <w:tc>
           <w:tcPr>
-            <w:tcW w:w="1200" w:type="dxa"/>
+            <w:tcW w:w="1000" w:type="dxa"/>
           </w:tcPr>
           <w:p>
             <w:pPr>
@@ -11050,6 +11578,38 @@
             </w:pPr>
             <w:r>
               <w:t xml:space="preserve">ServiceRootScanner、CodeGraphMerger</w:t>
+            </w:r>
+          </w:p>
+        </w:tc>
+        <w:tc>
+          <w:tcPr>
+            <w:tcW w:w="400" w:type="dxa"/>
+          </w:tcPr>
+          <w:p>
+            <w:pPr>
+              <w:pStyle w:val="TableCell"/>
+              <w:keepNext/>
+              <w:ind w:firstLine="0"/>
+              <w:jc w:val="left"/>
+            </w:pPr>
+            <w:r>
+              <w:t xml:space="preserve">3</w:t>
+            </w:r>
+          </w:p>
+        </w:tc>
+        <w:tc>
+          <w:tcPr>
+            <w:tcW w:w="400" w:type="dxa"/>
+          </w:tcPr>
+          <w:p>
+            <w:pPr>
+              <w:pStyle w:val="TableCell"/>
+              <w:keepNext/>
+              <w:ind w:firstLine="0"/>
+              <w:jc w:val="left"/>
+            </w:pPr>
+            <w:r>
+              <w:t xml:space="preserve">20</w:t>
             </w:r>
           </w:p>
         </w:tc>
@@ -11076,7 +11636,7 @@
         </w:tc>
         <w:tc>
           <w:tcPr>
-            <w:tcW w:w="2900" w:type="dxa"/>
+            <w:tcW w:w="2300" w:type="dxa"/>
           </w:tcPr>
           <w:p>
             <w:pPr>
@@ -11092,7 +11652,7 @@
         </w:tc>
         <w:tc>
           <w:tcPr>
-            <w:tcW w:w="1200" w:type="dxa"/>
+            <w:tcW w:w="1000" w:type="dxa"/>
           </w:tcPr>
           <w:p>
             <w:pPr>
@@ -11119,6 +11679,38 @@
             </w:pPr>
             <w:r>
               <w:t xml:space="preserve">查詢檔、CodeGraphMerger</w:t>
+            </w:r>
+          </w:p>
+        </w:tc>
+        <w:tc>
+          <w:tcPr>
+            <w:tcW w:w="400" w:type="dxa"/>
+          </w:tcPr>
+          <w:p>
+            <w:pPr>
+              <w:pStyle w:val="TableCell"/>
+              <w:keepNext/>
+              <w:ind w:firstLine="0"/>
+              <w:jc w:val="left"/>
+            </w:pPr>
+            <w:r>
+              <w:t xml:space="preserve">1</w:t>
+            </w:r>
+          </w:p>
+        </w:tc>
+        <w:tc>
+          <w:tcPr>
+            <w:tcW w:w="400" w:type="dxa"/>
+          </w:tcPr>
+          <w:p>
+            <w:pPr>
+              <w:pStyle w:val="TableCell"/>
+              <w:keepNext/>
+              <w:ind w:firstLine="0"/>
+              <w:jc w:val="left"/>
+            </w:pPr>
+            <w:r>
+              <w:t xml:space="preserve">7</w:t>
             </w:r>
           </w:p>
         </w:tc>
@@ -11145,7 +11737,7 @@
         </w:tc>
         <w:tc>
           <w:tcPr>
-            <w:tcW w:w="2900" w:type="dxa"/>
+            <w:tcW w:w="2300" w:type="dxa"/>
           </w:tcPr>
           <w:p>
             <w:pPr>
@@ -11161,7 +11753,7 @@
         </w:tc>
         <w:tc>
           <w:tcPr>
-            <w:tcW w:w="1200" w:type="dxa"/>
+            <w:tcW w:w="1000" w:type="dxa"/>
           </w:tcPr>
           <w:p>
             <w:pPr>
@@ -11188,6 +11780,38 @@
             </w:pPr>
             <w:r>
               <w:t xml:space="preserve">查詢檔、ConfigExtractor</w:t>
+            </w:r>
+          </w:p>
+        </w:tc>
+        <w:tc>
+          <w:tcPr>
+            <w:tcW w:w="400" w:type="dxa"/>
+          </w:tcPr>
+          <w:p>
+            <w:pPr>
+              <w:pStyle w:val="TableCell"/>
+              <w:keepNext/>
+              <w:ind w:firstLine="0"/>
+              <w:jc w:val="left"/>
+            </w:pPr>
+            <w:r>
+              <w:t xml:space="preserve">2</w:t>
+            </w:r>
+          </w:p>
+        </w:tc>
+        <w:tc>
+          <w:tcPr>
+            <w:tcW w:w="400" w:type="dxa"/>
+          </w:tcPr>
+          <w:p>
+            <w:pPr>
+              <w:pStyle w:val="TableCell"/>
+              <w:keepNext/>
+              <w:ind w:firstLine="0"/>
+              <w:jc w:val="left"/>
+            </w:pPr>
+            <w:r>
+              <w:t xml:space="preserve">20</w:t>
             </w:r>
           </w:p>
         </w:tc>
@@ -11214,7 +11838,7 @@
         </w:tc>
         <w:tc>
           <w:tcPr>
-            <w:tcW w:w="2900" w:type="dxa"/>
+            <w:tcW w:w="2300" w:type="dxa"/>
           </w:tcPr>
           <w:p>
             <w:pPr>
@@ -11230,7 +11854,7 @@
         </w:tc>
         <w:tc>
           <w:tcPr>
-            <w:tcW w:w="1200" w:type="dxa"/>
+            <w:tcW w:w="1000" w:type="dxa"/>
           </w:tcPr>
           <w:p>
             <w:pPr>
@@ -11257,6 +11881,38 @@
             </w:pPr>
             <w:r>
               <w:t xml:space="preserve">ConfigExtractor、CodeGraphMerger</w:t>
+            </w:r>
+          </w:p>
+        </w:tc>
+        <w:tc>
+          <w:tcPr>
+            <w:tcW w:w="400" w:type="dxa"/>
+          </w:tcPr>
+          <w:p>
+            <w:pPr>
+              <w:pStyle w:val="TableCell"/>
+              <w:keepNext/>
+              <w:ind w:firstLine="0"/>
+              <w:jc w:val="left"/>
+            </w:pPr>
+            <w:r>
+              <w:t xml:space="preserve">2</w:t>
+            </w:r>
+          </w:p>
+        </w:tc>
+        <w:tc>
+          <w:tcPr>
+            <w:tcW w:w="400" w:type="dxa"/>
+          </w:tcPr>
+          <w:p>
+            <w:pPr>
+              <w:pStyle w:val="TableCell"/>
+              <w:keepNext/>
+              <w:ind w:firstLine="0"/>
+              <w:jc w:val="left"/>
+            </w:pPr>
+            <w:r>
+              <w:t xml:space="preserve">10</w:t>
             </w:r>
           </w:p>
         </w:tc>
@@ -11283,7 +11939,7 @@
         </w:tc>
         <w:tc>
           <w:tcPr>
-            <w:tcW w:w="2900" w:type="dxa"/>
+            <w:tcW w:w="2300" w:type="dxa"/>
           </w:tcPr>
           <w:p>
             <w:pPr>
@@ -11299,7 +11955,7 @@
         </w:tc>
         <w:tc>
           <w:tcPr>
-            <w:tcW w:w="1200" w:type="dxa"/>
+            <w:tcW w:w="1000" w:type="dxa"/>
           </w:tcPr>
           <w:p>
             <w:pPr>
@@ -11326,6 +11982,38 @@
             </w:pPr>
             <w:r>
               <w:t xml:space="preserve">CodeGraphMerger</w:t>
+            </w:r>
+          </w:p>
+        </w:tc>
+        <w:tc>
+          <w:tcPr>
+            <w:tcW w:w="400" w:type="dxa"/>
+          </w:tcPr>
+          <w:p>
+            <w:pPr>
+              <w:pStyle w:val="TableCell"/>
+              <w:keepNext/>
+              <w:ind w:firstLine="0"/>
+              <w:jc w:val="left"/>
+            </w:pPr>
+            <w:r>
+              <w:t xml:space="preserve">6</w:t>
+            </w:r>
+          </w:p>
+        </w:tc>
+        <w:tc>
+          <w:tcPr>
+            <w:tcW w:w="400" w:type="dxa"/>
+          </w:tcPr>
+          <w:p>
+            <w:pPr>
+              <w:pStyle w:val="TableCell"/>
+              <w:keepNext/>
+              <w:ind w:firstLine="0"/>
+              <w:jc w:val="left"/>
+            </w:pPr>
+            <w:r>
+              <w:t xml:space="preserve">77</w:t>
             </w:r>
           </w:p>
         </w:tc>
@@ -11352,7 +12040,7 @@
         </w:tc>
         <w:tc>
           <w:tcPr>
-            <w:tcW w:w="2900" w:type="dxa"/>
+            <w:tcW w:w="2300" w:type="dxa"/>
           </w:tcPr>
           <w:p>
             <w:pPr>
@@ -11368,7 +12056,7 @@
         </w:tc>
         <w:tc>
           <w:tcPr>
-            <w:tcW w:w="1200" w:type="dxa"/>
+            <w:tcW w:w="1000" w:type="dxa"/>
           </w:tcPr>
           <w:p>
             <w:pPr>
@@ -11395,6 +12083,38 @@
             </w:pPr>
             <w:r>
               <w:t xml:space="preserve">ServiceRootScanner、查詢檔、CodeGraphMerger</w:t>
+            </w:r>
+          </w:p>
+        </w:tc>
+        <w:tc>
+          <w:tcPr>
+            <w:tcW w:w="400" w:type="dxa"/>
+          </w:tcPr>
+          <w:p>
+            <w:pPr>
+              <w:pStyle w:val="TableCell"/>
+              <w:keepNext/>
+              <w:ind w:firstLine="0"/>
+              <w:jc w:val="left"/>
+            </w:pPr>
+            <w:r>
+              <w:t xml:space="preserve">1</w:t>
+            </w:r>
+          </w:p>
+        </w:tc>
+        <w:tc>
+          <w:tcPr>
+            <w:tcW w:w="400" w:type="dxa"/>
+          </w:tcPr>
+          <w:p>
+            <w:pPr>
+              <w:pStyle w:val="TableCell"/>
+              <w:keepNext/>
+              <w:ind w:firstLine="0"/>
+              <w:jc w:val="left"/>
+            </w:pPr>
+            <w:r>
+              <w:t xml:space="preserve">7</w:t>
             </w:r>
           </w:p>
         </w:tc>
@@ -11421,7 +12141,7 @@
         </w:tc>
         <w:tc>
           <w:tcPr>
-            <w:tcW w:w="2900" w:type="dxa"/>
+            <w:tcW w:w="2300" w:type="dxa"/>
           </w:tcPr>
           <w:p>
             <w:pPr>
@@ -11437,7 +12157,7 @@
         </w:tc>
         <w:tc>
           <w:tcPr>
-            <w:tcW w:w="1200" w:type="dxa"/>
+            <w:tcW w:w="1000" w:type="dxa"/>
           </w:tcPr>
           <w:p>
             <w:pPr>
@@ -11464,6 +12184,38 @@
             </w:pPr>
             <w:r>
               <w:t xml:space="preserve">查詢檔、TreeSitterExtractor</w:t>
+            </w:r>
+          </w:p>
+        </w:tc>
+        <w:tc>
+          <w:tcPr>
+            <w:tcW w:w="400" w:type="dxa"/>
+          </w:tcPr>
+          <w:p>
+            <w:pPr>
+              <w:pStyle w:val="TableCell"/>
+              <w:keepNext/>
+              <w:ind w:firstLine="0"/>
+              <w:jc w:val="left"/>
+            </w:pPr>
+            <w:r>
+              <w:t xml:space="preserve">5</w:t>
+            </w:r>
+          </w:p>
+        </w:tc>
+        <w:tc>
+          <w:tcPr>
+            <w:tcW w:w="400" w:type="dxa"/>
+          </w:tcPr>
+          <w:p>
+            <w:pPr>
+              <w:pStyle w:val="TableCell"/>
+              <w:keepNext/>
+              <w:ind w:firstLine="0"/>
+              <w:jc w:val="left"/>
+            </w:pPr>
+            <w:r>
+              <w:t xml:space="preserve">66</w:t>
             </w:r>
           </w:p>
         </w:tc>
@@ -11490,7 +12242,7 @@
         </w:tc>
         <w:tc>
           <w:tcPr>
-            <w:tcW w:w="2900" w:type="dxa"/>
+            <w:tcW w:w="2300" w:type="dxa"/>
           </w:tcPr>
           <w:p>
             <w:pPr>
@@ -11506,7 +12258,7 @@
         </w:tc>
         <w:tc>
           <w:tcPr>
-            <w:tcW w:w="1200" w:type="dxa"/>
+            <w:tcW w:w="1000" w:type="dxa"/>
           </w:tcPr>
           <w:p>
             <w:pPr>
@@ -11533,6 +12285,38 @@
             </w:pPr>
             <w:r>
               <w:t xml:space="preserve">CodeGraphMerger</w:t>
+            </w:r>
+          </w:p>
+        </w:tc>
+        <w:tc>
+          <w:tcPr>
+            <w:tcW w:w="400" w:type="dxa"/>
+          </w:tcPr>
+          <w:p>
+            <w:pPr>
+              <w:pStyle w:val="TableCell"/>
+              <w:keepNext/>
+              <w:ind w:firstLine="0"/>
+              <w:jc w:val="left"/>
+            </w:pPr>
+            <w:r>
+              <w:t xml:space="preserve">1</w:t>
+            </w:r>
+          </w:p>
+        </w:tc>
+        <w:tc>
+          <w:tcPr>
+            <w:tcW w:w="400" w:type="dxa"/>
+          </w:tcPr>
+          <w:p>
+            <w:pPr>
+              <w:pStyle w:val="TableCell"/>
+              <w:keepNext/>
+              <w:ind w:firstLine="0"/>
+              <w:jc w:val="left"/>
+            </w:pPr>
+            <w:r>
+              <w:t xml:space="preserve">24</w:t>
             </w:r>
           </w:p>
         </w:tc>
@@ -11559,7 +12343,7 @@
         </w:tc>
         <w:tc>
           <w:tcPr>
-            <w:tcW w:w="2900" w:type="dxa"/>
+            <w:tcW w:w="2300" w:type="dxa"/>
           </w:tcPr>
           <w:p>
             <w:pPr>
@@ -11575,7 +12359,7 @@
         </w:tc>
         <w:tc>
           <w:tcPr>
-            <w:tcW w:w="1200" w:type="dxa"/>
+            <w:tcW w:w="1000" w:type="dxa"/>
           </w:tcPr>
           <w:p>
             <w:pPr>
@@ -11602,6 +12386,38 @@
             </w:pPr>
             <w:r>
               <w:t xml:space="preserve">ConfigExtractor</w:t>
+            </w:r>
+          </w:p>
+        </w:tc>
+        <w:tc>
+          <w:tcPr>
+            <w:tcW w:w="400" w:type="dxa"/>
+          </w:tcPr>
+          <w:p>
+            <w:pPr>
+              <w:pStyle w:val="TableCell"/>
+              <w:keepNext/>
+              <w:ind w:firstLine="0"/>
+              <w:jc w:val="left"/>
+            </w:pPr>
+            <w:r>
+              <w:t xml:space="preserve">2</w:t>
+            </w:r>
+          </w:p>
+        </w:tc>
+        <w:tc>
+          <w:tcPr>
+            <w:tcW w:w="400" w:type="dxa"/>
+          </w:tcPr>
+          <w:p>
+            <w:pPr>
+              <w:pStyle w:val="TableCell"/>
+              <w:keepNext/>
+              <w:ind w:firstLine="0"/>
+              <w:jc w:val="left"/>
+            </w:pPr>
+            <w:r>
+              <w:t xml:space="preserve">153</w:t>
             </w:r>
           </w:p>
         </w:tc>
@@ -11628,7 +12444,7 @@
         </w:tc>
         <w:tc>
           <w:tcPr>
-            <w:tcW w:w="2900" w:type="dxa"/>
+            <w:tcW w:w="2300" w:type="dxa"/>
           </w:tcPr>
           <w:p>
             <w:pPr>
@@ -11644,7 +12460,7 @@
         </w:tc>
         <w:tc>
           <w:tcPr>
-            <w:tcW w:w="1200" w:type="dxa"/>
+            <w:tcW w:w="1000" w:type="dxa"/>
           </w:tcPr>
           <w:p>
             <w:pPr>
@@ -11671,6 +12487,38 @@
             </w:pPr>
             <w:r>
               <w:t xml:space="preserve">ConfigExtractor、CodeGraphMerger</w:t>
+            </w:r>
+          </w:p>
+        </w:tc>
+        <w:tc>
+          <w:tcPr>
+            <w:tcW w:w="400" w:type="dxa"/>
+          </w:tcPr>
+          <w:p>
+            <w:pPr>
+              <w:pStyle w:val="TableCell"/>
+              <w:keepNext/>
+              <w:ind w:firstLine="0"/>
+              <w:jc w:val="left"/>
+            </w:pPr>
+            <w:r>
+              <w:t xml:space="preserve">1</w:t>
+            </w:r>
+          </w:p>
+        </w:tc>
+        <w:tc>
+          <w:tcPr>
+            <w:tcW w:w="400" w:type="dxa"/>
+          </w:tcPr>
+          <w:p>
+            <w:pPr>
+              <w:pStyle w:val="TableCell"/>
+              <w:keepNext/>
+              <w:ind w:firstLine="0"/>
+              <w:jc w:val="left"/>
+            </w:pPr>
+            <w:r>
+              <w:t xml:space="preserve">14</w:t>
             </w:r>
           </w:p>
         </w:tc>
@@ -11697,7 +12545,7 @@
         </w:tc>
         <w:tc>
           <w:tcPr>
-            <w:tcW w:w="2900" w:type="dxa"/>
+            <w:tcW w:w="2300" w:type="dxa"/>
           </w:tcPr>
           <w:p>
             <w:pPr>
@@ -11713,7 +12561,7 @@
         </w:tc>
         <w:tc>
           <w:tcPr>
-            <w:tcW w:w="1200" w:type="dxa"/>
+            <w:tcW w:w="1000" w:type="dxa"/>
           </w:tcPr>
           <w:p>
             <w:pPr>
@@ -11740,6 +12588,38 @@
             </w:pPr>
             <w:r>
               <w:t xml:space="preserve">CodeGraphMerger</w:t>
+            </w:r>
+          </w:p>
+        </w:tc>
+        <w:tc>
+          <w:tcPr>
+            <w:tcW w:w="400" w:type="dxa"/>
+          </w:tcPr>
+          <w:p>
+            <w:pPr>
+              <w:pStyle w:val="TableCell"/>
+              <w:keepNext/>
+              <w:ind w:firstLine="0"/>
+              <w:jc w:val="left"/>
+            </w:pPr>
+            <w:r>
+              <w:t xml:space="preserve">0</w:t>
+            </w:r>
+          </w:p>
+        </w:tc>
+        <w:tc>
+          <w:tcPr>
+            <w:tcW w:w="400" w:type="dxa"/>
+          </w:tcPr>
+          <w:p>
+            <w:pPr>
+              <w:pStyle w:val="TableCell"/>
+              <w:keepNext/>
+              <w:ind w:firstLine="0"/>
+              <w:jc w:val="left"/>
+            </w:pPr>
+            <w:r>
+              <w:t xml:space="preserve">0</w:t>
             </w:r>
           </w:p>
         </w:tc>
@@ -11766,7 +12646,7 @@
         </w:tc>
         <w:tc>
           <w:tcPr>
-            <w:tcW w:w="2900" w:type="dxa"/>
+            <w:tcW w:w="2300" w:type="dxa"/>
           </w:tcPr>
           <w:p>
             <w:pPr>
@@ -11782,7 +12662,7 @@
         </w:tc>
         <w:tc>
           <w:tcPr>
-            <w:tcW w:w="1200" w:type="dxa"/>
+            <w:tcW w:w="1000" w:type="dxa"/>
           </w:tcPr>
           <w:p>
             <w:pPr>
@@ -11809,6 +12689,38 @@
             </w:pPr>
             <w:r>
               <w:t xml:space="preserve">ConfigExtractor、CodeGraphMerger</w:t>
+            </w:r>
+          </w:p>
+        </w:tc>
+        <w:tc>
+          <w:tcPr>
+            <w:tcW w:w="400" w:type="dxa"/>
+          </w:tcPr>
+          <w:p>
+            <w:pPr>
+              <w:pStyle w:val="TableCell"/>
+              <w:keepNext/>
+              <w:ind w:firstLine="0"/>
+              <w:jc w:val="left"/>
+            </w:pPr>
+            <w:r>
+              <w:t xml:space="preserve">3</w:t>
+            </w:r>
+          </w:p>
+        </w:tc>
+        <w:tc>
+          <w:tcPr>
+            <w:tcW w:w="400" w:type="dxa"/>
+          </w:tcPr>
+          <w:p>
+            <w:pPr>
+              <w:pStyle w:val="TableCell"/>
+              <w:keepNext/>
+              <w:ind w:firstLine="0"/>
+              <w:jc w:val="left"/>
+            </w:pPr>
+            <w:r>
+              <w:t xml:space="preserve">14</w:t>
             </w:r>
           </w:p>
         </w:tc>
@@ -11835,7 +12747,7 @@
         </w:tc>
         <w:tc>
           <w:tcPr>
-            <w:tcW w:w="2900" w:type="dxa"/>
+            <w:tcW w:w="2300" w:type="dxa"/>
           </w:tcPr>
           <w:p>
             <w:pPr>
@@ -11851,7 +12763,7 @@
         </w:tc>
         <w:tc>
           <w:tcPr>
-            <w:tcW w:w="1200" w:type="dxa"/>
+            <w:tcW w:w="1000" w:type="dxa"/>
           </w:tcPr>
           <w:p>
             <w:pPr>
@@ -11878,6 +12790,38 @@
             </w:pPr>
             <w:r>
               <w:t xml:space="preserve">StackDetector、TreeSitterExtractor</w:t>
+            </w:r>
+          </w:p>
+        </w:tc>
+        <w:tc>
+          <w:tcPr>
+            <w:tcW w:w="400" w:type="dxa"/>
+          </w:tcPr>
+          <w:p>
+            <w:pPr>
+              <w:pStyle w:val="TableCell"/>
+              <w:keepNext/>
+              <w:ind w:firstLine="0"/>
+              <w:jc w:val="left"/>
+            </w:pPr>
+            <w:r>
+              <w:t xml:space="preserve">1</w:t>
+            </w:r>
+          </w:p>
+        </w:tc>
+        <w:tc>
+          <w:tcPr>
+            <w:tcW w:w="400" w:type="dxa"/>
+          </w:tcPr>
+          <w:p>
+            <w:pPr>
+              <w:pStyle w:val="TableCell"/>
+              <w:keepNext/>
+              <w:ind w:firstLine="0"/>
+              <w:jc w:val="left"/>
+            </w:pPr>
+            <w:r>
+              <w:t xml:space="preserve">3</w:t>
             </w:r>
           </w:p>
         </w:tc>
@@ -11904,7 +12848,7 @@
         </w:tc>
         <w:tc>
           <w:tcPr>
-            <w:tcW w:w="2900" w:type="dxa"/>
+            <w:tcW w:w="2300" w:type="dxa"/>
           </w:tcPr>
           <w:p>
             <w:pPr>
@@ -11920,7 +12864,7 @@
         </w:tc>
         <w:tc>
           <w:tcPr>
-            <w:tcW w:w="1200" w:type="dxa"/>
+            <w:tcW w:w="1000" w:type="dxa"/>
           </w:tcPr>
           <w:p>
             <w:pPr>
@@ -11947,6 +12891,38 @@
             </w:pPr>
             <w:r>
               <w:t xml:space="preserve">查詢檔、TreeSitterExtractor</w:t>
+            </w:r>
+          </w:p>
+        </w:tc>
+        <w:tc>
+          <w:tcPr>
+            <w:tcW w:w="400" w:type="dxa"/>
+          </w:tcPr>
+          <w:p>
+            <w:pPr>
+              <w:pStyle w:val="TableCell"/>
+              <w:keepNext/>
+              <w:ind w:firstLine="0"/>
+              <w:jc w:val="left"/>
+            </w:pPr>
+            <w:r>
+              <w:t xml:space="preserve">3</w:t>
+            </w:r>
+          </w:p>
+        </w:tc>
+        <w:tc>
+          <w:tcPr>
+            <w:tcW w:w="400" w:type="dxa"/>
+          </w:tcPr>
+          <w:p>
+            <w:pPr>
+              <w:pStyle w:val="TableCell"/>
+              <w:keepNext/>
+              <w:ind w:firstLine="0"/>
+              <w:jc w:val="left"/>
+            </w:pPr>
+            <w:r>
+              <w:t xml:space="preserve">4</w:t>
             </w:r>
           </w:p>
         </w:tc>
@@ -11973,7 +12949,7 @@
         </w:tc>
         <w:tc>
           <w:tcPr>
-            <w:tcW w:w="2900" w:type="dxa"/>
+            <w:tcW w:w="2300" w:type="dxa"/>
           </w:tcPr>
           <w:p>
             <w:pPr>
@@ -11989,7 +12965,7 @@
         </w:tc>
         <w:tc>
           <w:tcPr>
-            <w:tcW w:w="1200" w:type="dxa"/>
+            <w:tcW w:w="1000" w:type="dxa"/>
           </w:tcPr>
           <w:p>
             <w:pPr>
@@ -12016,6 +12992,38 @@
             </w:pPr>
             <w:r>
               <w:t xml:space="preserve">CodeGraphMerger</w:t>
+            </w:r>
+          </w:p>
+        </w:tc>
+        <w:tc>
+          <w:tcPr>
+            <w:tcW w:w="400" w:type="dxa"/>
+          </w:tcPr>
+          <w:p>
+            <w:pPr>
+              <w:pStyle w:val="TableCell"/>
+              <w:keepNext/>
+              <w:ind w:firstLine="0"/>
+              <w:jc w:val="left"/>
+            </w:pPr>
+            <w:r>
+              <w:t xml:space="preserve">2</w:t>
+            </w:r>
+          </w:p>
+        </w:tc>
+        <w:tc>
+          <w:tcPr>
+            <w:tcW w:w="400" w:type="dxa"/>
+          </w:tcPr>
+          <w:p>
+            <w:pPr>
+              <w:pStyle w:val="TableCell"/>
+              <w:keepNext/>
+              <w:ind w:firstLine="0"/>
+              <w:jc w:val="left"/>
+            </w:pPr>
+            <w:r>
+              <w:t xml:space="preserve">4</w:t>
             </w:r>
           </w:p>
         </w:tc>
@@ -12042,7 +13050,7 @@
         </w:tc>
         <w:tc>
           <w:tcPr>
-            <w:tcW w:w="2900" w:type="dxa"/>
+            <w:tcW w:w="2300" w:type="dxa"/>
           </w:tcPr>
           <w:p>
             <w:pPr>
@@ -12058,7 +13066,7 @@
         </w:tc>
         <w:tc>
           <w:tcPr>
-            <w:tcW w:w="1200" w:type="dxa"/>
+            <w:tcW w:w="1000" w:type="dxa"/>
           </w:tcPr>
           <w:p>
             <w:pPr>
@@ -12085,6 +13093,38 @@
             </w:pPr>
             <w:r>
               <w:t xml:space="preserve">ConfigExtractor、ServiceRootScanner</w:t>
+            </w:r>
+          </w:p>
+        </w:tc>
+        <w:tc>
+          <w:tcPr>
+            <w:tcW w:w="400" w:type="dxa"/>
+          </w:tcPr>
+          <w:p>
+            <w:pPr>
+              <w:pStyle w:val="TableCell"/>
+              <w:keepNext/>
+              <w:ind w:firstLine="0"/>
+              <w:jc w:val="left"/>
+            </w:pPr>
+            <w:r>
+              <w:t xml:space="preserve">3</w:t>
+            </w:r>
+          </w:p>
+        </w:tc>
+        <w:tc>
+          <w:tcPr>
+            <w:tcW w:w="400" w:type="dxa"/>
+          </w:tcPr>
+          <w:p>
+            <w:pPr>
+              <w:pStyle w:val="TableCell"/>
+              <w:keepNext/>
+              <w:ind w:firstLine="0"/>
+              <w:jc w:val="left"/>
+            </w:pPr>
+            <w:r>
+              <w:t xml:space="preserve">3</w:t>
             </w:r>
           </w:p>
         </w:tc>
@@ -12111,7 +13151,7 @@
         </w:tc>
         <w:tc>
           <w:tcPr>
-            <w:tcW w:w="2900" w:type="dxa"/>
+            <w:tcW w:w="2300" w:type="dxa"/>
           </w:tcPr>
           <w:p>
             <w:pPr>
@@ -12127,7 +13167,7 @@
         </w:tc>
         <w:tc>
           <w:tcPr>
-            <w:tcW w:w="1200" w:type="dxa"/>
+            <w:tcW w:w="1000" w:type="dxa"/>
           </w:tcPr>
           <w:p>
             <w:pPr>
@@ -12154,6 +13194,38 @@
             </w:pPr>
             <w:r>
               <w:t xml:space="preserve">ConfigExtractor</w:t>
+            </w:r>
+          </w:p>
+        </w:tc>
+        <w:tc>
+          <w:tcPr>
+            <w:tcW w:w="400" w:type="dxa"/>
+          </w:tcPr>
+          <w:p>
+            <w:pPr>
+              <w:pStyle w:val="TableCell"/>
+              <w:keepNext/>
+              <w:ind w:firstLine="0"/>
+              <w:jc w:val="left"/>
+            </w:pPr>
+            <w:r>
+              <w:t xml:space="preserve">2</w:t>
+            </w:r>
+          </w:p>
+        </w:tc>
+        <w:tc>
+          <w:tcPr>
+            <w:tcW w:w="400" w:type="dxa"/>
+          </w:tcPr>
+          <w:p>
+            <w:pPr>
+              <w:pStyle w:val="TableCell"/>
+              <w:keepNext/>
+              <w:ind w:firstLine="0"/>
+              <w:jc w:val="left"/>
+            </w:pPr>
+            <w:r>
+              <w:t xml:space="preserve">3</w:t>
             </w:r>
           </w:p>
         </w:tc>
@@ -12180,7 +13252,7 @@
         </w:tc>
         <w:tc>
           <w:tcPr>
-            <w:tcW w:w="2900" w:type="dxa"/>
+            <w:tcW w:w="2300" w:type="dxa"/>
           </w:tcPr>
           <w:p>
             <w:pPr>
@@ -12196,7 +13268,7 @@
         </w:tc>
         <w:tc>
           <w:tcPr>
-            <w:tcW w:w="1200" w:type="dxa"/>
+            <w:tcW w:w="1000" w:type="dxa"/>
           </w:tcPr>
           <w:p>
             <w:pPr>
@@ -12223,6 +13295,38 @@
             </w:pPr>
             <w:r>
               <w:t xml:space="preserve">CodeGraphMerger、ExternalHostDetector</w:t>
+            </w:r>
+          </w:p>
+        </w:tc>
+        <w:tc>
+          <w:tcPr>
+            <w:tcW w:w="400" w:type="dxa"/>
+          </w:tcPr>
+          <w:p>
+            <w:pPr>
+              <w:pStyle w:val="TableCell"/>
+              <w:keepNext/>
+              <w:ind w:firstLine="0"/>
+              <w:jc w:val="left"/>
+            </w:pPr>
+            <w:r>
+              <w:t xml:space="preserve">2</w:t>
+            </w:r>
+          </w:p>
+        </w:tc>
+        <w:tc>
+          <w:tcPr>
+            <w:tcW w:w="400" w:type="dxa"/>
+          </w:tcPr>
+          <w:p>
+            <w:pPr>
+              <w:pStyle w:val="TableCell"/>
+              <w:keepNext/>
+              <w:ind w:firstLine="0"/>
+              <w:jc w:val="left"/>
+            </w:pPr>
+            <w:r>
+              <w:t xml:space="preserve">2</w:t>
             </w:r>
           </w:p>
         </w:tc>
@@ -12249,7 +13353,7 @@
         </w:tc>
         <w:tc>
           <w:tcPr>
-            <w:tcW w:w="2900" w:type="dxa"/>
+            <w:tcW w:w="2300" w:type="dxa"/>
           </w:tcPr>
           <w:p>
             <w:pPr>
@@ -12265,7 +13369,7 @@
         </w:tc>
         <w:tc>
           <w:tcPr>
-            <w:tcW w:w="1200" w:type="dxa"/>
+            <w:tcW w:w="1000" w:type="dxa"/>
           </w:tcPr>
           <w:p>
             <w:pPr>
@@ -12292,6 +13396,38 @@
             </w:pPr>
             <w:r>
               <w:t xml:space="preserve">ConfigExtractor</w:t>
+            </w:r>
+          </w:p>
+        </w:tc>
+        <w:tc>
+          <w:tcPr>
+            <w:tcW w:w="400" w:type="dxa"/>
+          </w:tcPr>
+          <w:p>
+            <w:pPr>
+              <w:pStyle w:val="TableCell"/>
+              <w:keepNext/>
+              <w:ind w:firstLine="0"/>
+              <w:jc w:val="left"/>
+            </w:pPr>
+            <w:r>
+              <w:t xml:space="preserve">1</w:t>
+            </w:r>
+          </w:p>
+        </w:tc>
+        <w:tc>
+          <w:tcPr>
+            <w:tcW w:w="400" w:type="dxa"/>
+          </w:tcPr>
+          <w:p>
+            <w:pPr>
+              <w:pStyle w:val="TableCell"/>
+              <w:keepNext/>
+              <w:ind w:firstLine="0"/>
+              <w:jc w:val="left"/>
+            </w:pPr>
+            <w:r>
+              <w:t xml:space="preserve">12</w:t>
             </w:r>
           </w:p>
         </w:tc>
@@ -12318,7 +13454,7 @@
         </w:tc>
         <w:tc>
           <w:tcPr>
-            <w:tcW w:w="2900" w:type="dxa"/>
+            <w:tcW w:w="2300" w:type="dxa"/>
           </w:tcPr>
           <w:p>
             <w:pPr>
@@ -12334,7 +13470,7 @@
         </w:tc>
         <w:tc>
           <w:tcPr>
-            <w:tcW w:w="1200" w:type="dxa"/>
+            <w:tcW w:w="1000" w:type="dxa"/>
           </w:tcPr>
           <w:p>
             <w:pPr>
@@ -12361,6 +13497,38 @@
             </w:pPr>
             <w:r>
               <w:t xml:space="preserve">CodeGraphMerger</w:t>
+            </w:r>
+          </w:p>
+        </w:tc>
+        <w:tc>
+          <w:tcPr>
+            <w:tcW w:w="400" w:type="dxa"/>
+          </w:tcPr>
+          <w:p>
+            <w:pPr>
+              <w:pStyle w:val="TableCell"/>
+              <w:keepNext/>
+              <w:ind w:firstLine="0"/>
+              <w:jc w:val="left"/>
+            </w:pPr>
+            <w:r>
+              <w:t xml:space="preserve">14</w:t>
+            </w:r>
+          </w:p>
+        </w:tc>
+        <w:tc>
+          <w:tcPr>
+            <w:tcW w:w="400" w:type="dxa"/>
+          </w:tcPr>
+          <w:p>
+            <w:pPr>
+              <w:pStyle w:val="TableCell"/>
+              <w:keepNext/>
+              <w:ind w:firstLine="0"/>
+              <w:jc w:val="left"/>
+            </w:pPr>
+            <w:r>
+              <w:t xml:space="preserve">244</w:t>
             </w:r>
           </w:p>
         </w:tc>
@@ -12387,7 +13555,7 @@
         </w:tc>
         <w:tc>
           <w:tcPr>
-            <w:tcW w:w="2900" w:type="dxa"/>
+            <w:tcW w:w="2300" w:type="dxa"/>
           </w:tcPr>
           <w:p>
             <w:pPr>
@@ -12403,7 +13571,7 @@
         </w:tc>
         <w:tc>
           <w:tcPr>
-            <w:tcW w:w="1200" w:type="dxa"/>
+            <w:tcW w:w="1000" w:type="dxa"/>
           </w:tcPr>
           <w:p>
             <w:pPr>
@@ -12430,6 +13598,38 @@
             </w:pPr>
             <w:r>
               <w:t xml:space="preserve">ConfigExtractor、CodeGraphMerger</w:t>
+            </w:r>
+          </w:p>
+        </w:tc>
+        <w:tc>
+          <w:tcPr>
+            <w:tcW w:w="400" w:type="dxa"/>
+          </w:tcPr>
+          <w:p>
+            <w:pPr>
+              <w:pStyle w:val="TableCell"/>
+              <w:keepNext/>
+              <w:ind w:firstLine="0"/>
+              <w:jc w:val="left"/>
+            </w:pPr>
+            <w:r>
+              <w:t xml:space="preserve">6</w:t>
+            </w:r>
+          </w:p>
+        </w:tc>
+        <w:tc>
+          <w:tcPr>
+            <w:tcW w:w="400" w:type="dxa"/>
+          </w:tcPr>
+          <w:p>
+            <w:pPr>
+              <w:pStyle w:val="TableCell"/>
+              <w:keepNext/>
+              <w:ind w:firstLine="0"/>
+              <w:jc w:val="left"/>
+            </w:pPr>
+            <w:r>
+              <w:t xml:space="preserve">20</w:t>
             </w:r>
           </w:p>
         </w:tc>
@@ -12456,7 +13656,7 @@
         </w:tc>
         <w:tc>
           <w:tcPr>
-            <w:tcW w:w="2900" w:type="dxa"/>
+            <w:tcW w:w="2300" w:type="dxa"/>
           </w:tcPr>
           <w:p>
             <w:pPr>
@@ -12472,7 +13672,7 @@
         </w:tc>
         <w:tc>
           <w:tcPr>
-            <w:tcW w:w="1200" w:type="dxa"/>
+            <w:tcW w:w="1000" w:type="dxa"/>
           </w:tcPr>
           <w:p>
             <w:pPr>
@@ -12499,6 +13699,38 @@
             </w:pPr>
             <w:r>
               <w:t xml:space="preserve">ConfigExtractor、CodeGraphMerger</w:t>
+            </w:r>
+          </w:p>
+        </w:tc>
+        <w:tc>
+          <w:tcPr>
+            <w:tcW w:w="400" w:type="dxa"/>
+          </w:tcPr>
+          <w:p>
+            <w:pPr>
+              <w:pStyle w:val="TableCell"/>
+              <w:keepNext/>
+              <w:ind w:firstLine="0"/>
+              <w:jc w:val="left"/>
+            </w:pPr>
+            <w:r>
+              <w:t xml:space="preserve">2</w:t>
+            </w:r>
+          </w:p>
+        </w:tc>
+        <w:tc>
+          <w:tcPr>
+            <w:tcW w:w="400" w:type="dxa"/>
+          </w:tcPr>
+          <w:p>
+            <w:pPr>
+              <w:pStyle w:val="TableCell"/>
+              <w:keepNext/>
+              <w:ind w:firstLine="0"/>
+              <w:jc w:val="left"/>
+            </w:pPr>
+            <w:r>
+              <w:t xml:space="preserve">13</w:t>
             </w:r>
           </w:p>
         </w:tc>
@@ -12525,7 +13757,7 @@
         </w:tc>
         <w:tc>
           <w:tcPr>
-            <w:tcW w:w="2900" w:type="dxa"/>
+            <w:tcW w:w="2300" w:type="dxa"/>
           </w:tcPr>
           <w:p>
             <w:pPr>
@@ -12551,7 +13783,7 @@
         </w:tc>
         <w:tc>
           <w:tcPr>
-            <w:tcW w:w="1200" w:type="dxa"/>
+            <w:tcW w:w="1000" w:type="dxa"/>
           </w:tcPr>
           <w:p>
             <w:pPr>
@@ -12578,6 +13810,38 @@
             </w:pPr>
             <w:r>
               <w:t xml:space="preserve">ConfigExtractor</w:t>
+            </w:r>
+          </w:p>
+        </w:tc>
+        <w:tc>
+          <w:tcPr>
+            <w:tcW w:w="400" w:type="dxa"/>
+          </w:tcPr>
+          <w:p>
+            <w:pPr>
+              <w:pStyle w:val="TableCell"/>
+              <w:keepNext/>
+              <w:ind w:firstLine="0"/>
+              <w:jc w:val="left"/>
+            </w:pPr>
+            <w:r>
+              <w:t xml:space="preserve">1</w:t>
+            </w:r>
+          </w:p>
+        </w:tc>
+        <w:tc>
+          <w:tcPr>
+            <w:tcW w:w="400" w:type="dxa"/>
+          </w:tcPr>
+          <w:p>
+            <w:pPr>
+              <w:pStyle w:val="TableCell"/>
+              <w:keepNext/>
+              <w:ind w:firstLine="0"/>
+              <w:jc w:val="left"/>
+            </w:pPr>
+            <w:r>
+              <w:t xml:space="preserve">12</w:t>
             </w:r>
           </w:p>
         </w:tc>
@@ -12604,7 +13868,7 @@
         </w:tc>
         <w:tc>
           <w:tcPr>
-            <w:tcW w:w="2900" w:type="dxa"/>
+            <w:tcW w:w="2300" w:type="dxa"/>
           </w:tcPr>
           <w:p>
             <w:pPr>
@@ -12620,7 +13884,7 @@
         </w:tc>
         <w:tc>
           <w:tcPr>
-            <w:tcW w:w="1200" w:type="dxa"/>
+            <w:tcW w:w="1000" w:type="dxa"/>
           </w:tcPr>
           <w:p>
             <w:pPr>
@@ -12647,6 +13911,38 @@
             </w:pPr>
             <w:r>
               <w:t xml:space="preserve">ConfigExtractor、CodeGraphMerger</w:t>
+            </w:r>
+          </w:p>
+        </w:tc>
+        <w:tc>
+          <w:tcPr>
+            <w:tcW w:w="400" w:type="dxa"/>
+          </w:tcPr>
+          <w:p>
+            <w:pPr>
+              <w:pStyle w:val="TableCell"/>
+              <w:keepNext/>
+              <w:ind w:firstLine="0"/>
+              <w:jc w:val="left"/>
+            </w:pPr>
+            <w:r>
+              <w:t xml:space="preserve">1</w:t>
+            </w:r>
+          </w:p>
+        </w:tc>
+        <w:tc>
+          <w:tcPr>
+            <w:tcW w:w="400" w:type="dxa"/>
+          </w:tcPr>
+          <w:p>
+            <w:pPr>
+              <w:pStyle w:val="TableCell"/>
+              <w:keepNext/>
+              <w:ind w:firstLine="0"/>
+              <w:jc w:val="left"/>
+            </w:pPr>
+            <w:r>
+              <w:t xml:space="preserve">7</w:t>
             </w:r>
           </w:p>
         </w:tc>
@@ -12673,7 +13969,7 @@
         </w:tc>
         <w:tc>
           <w:tcPr>
-            <w:tcW w:w="2900" w:type="dxa"/>
+            <w:tcW w:w="2300" w:type="dxa"/>
           </w:tcPr>
           <w:p>
             <w:pPr>
@@ -12689,7 +13985,7 @@
         </w:tc>
         <w:tc>
           <w:tcPr>
-            <w:tcW w:w="1200" w:type="dxa"/>
+            <w:tcW w:w="1000" w:type="dxa"/>
           </w:tcPr>
           <w:p>
             <w:pPr>
@@ -12716,6 +14012,38 @@
             </w:pPr>
             <w:r>
               <w:t xml:space="preserve">StackDetector、TreeSitterExtractor</w:t>
+            </w:r>
+          </w:p>
+        </w:tc>
+        <w:tc>
+          <w:tcPr>
+            <w:tcW w:w="400" w:type="dxa"/>
+          </w:tcPr>
+          <w:p>
+            <w:pPr>
+              <w:pStyle w:val="TableCell"/>
+              <w:keepNext/>
+              <w:ind w:firstLine="0"/>
+              <w:jc w:val="left"/>
+            </w:pPr>
+            <w:r>
+              <w:t xml:space="preserve">3</w:t>
+            </w:r>
+          </w:p>
+        </w:tc>
+        <w:tc>
+          <w:tcPr>
+            <w:tcW w:w="400" w:type="dxa"/>
+          </w:tcPr>
+          <w:p>
+            <w:pPr>
+              <w:pStyle w:val="TableCell"/>
+              <w:keepNext/>
+              <w:ind w:firstLine="0"/>
+              <w:jc w:val="left"/>
+            </w:pPr>
+            <w:r>
+              <w:t xml:space="preserve">166</w:t>
             </w:r>
           </w:p>
         </w:tc>
@@ -12742,7 +14070,7 @@
         </w:tc>
         <w:tc>
           <w:tcPr>
-            <w:tcW w:w="2900" w:type="dxa"/>
+            <w:tcW w:w="2300" w:type="dxa"/>
           </w:tcPr>
           <w:p>
             <w:pPr>
@@ -12758,7 +14086,7 @@
         </w:tc>
         <w:tc>
           <w:tcPr>
-            <w:tcW w:w="1200" w:type="dxa"/>
+            <w:tcW w:w="1000" w:type="dxa"/>
           </w:tcPr>
           <w:p>
             <w:pPr>
@@ -12785,6 +14113,38 @@
             </w:pPr>
             <w:r>
               <w:t xml:space="preserve">ServiceRootScanner、CodeGraphMerger</w:t>
+            </w:r>
+          </w:p>
+        </w:tc>
+        <w:tc>
+          <w:tcPr>
+            <w:tcW w:w="400" w:type="dxa"/>
+          </w:tcPr>
+          <w:p>
+            <w:pPr>
+              <w:pStyle w:val="TableCell"/>
+              <w:keepNext/>
+              <w:ind w:firstLine="0"/>
+              <w:jc w:val="left"/>
+            </w:pPr>
+            <w:r>
+              <w:t xml:space="preserve">5</w:t>
+            </w:r>
+          </w:p>
+        </w:tc>
+        <w:tc>
+          <w:tcPr>
+            <w:tcW w:w="400" w:type="dxa"/>
+          </w:tcPr>
+          <w:p>
+            <w:pPr>
+              <w:pStyle w:val="TableCell"/>
+              <w:keepNext/>
+              <w:ind w:firstLine="0"/>
+              <w:jc w:val="left"/>
+            </w:pPr>
+            <w:r>
+              <w:t xml:space="preserve">54</w:t>
             </w:r>
           </w:p>
         </w:tc>
@@ -12811,7 +14171,7 @@
         </w:tc>
         <w:tc>
           <w:tcPr>
-            <w:tcW w:w="2900" w:type="dxa"/>
+            <w:tcW w:w="2300" w:type="dxa"/>
           </w:tcPr>
           <w:p>
             <w:pPr>
@@ -12827,7 +14187,7 @@
         </w:tc>
         <w:tc>
           <w:tcPr>
-            <w:tcW w:w="1200" w:type="dxa"/>
+            <w:tcW w:w="1000" w:type="dxa"/>
           </w:tcPr>
           <w:p>
             <w:pPr>
@@ -12854,6 +14214,38 @@
             </w:pPr>
             <w:r>
               <w:t xml:space="preserve">SourceScanner、ServiceRootScanner</w:t>
+            </w:r>
+          </w:p>
+        </w:tc>
+        <w:tc>
+          <w:tcPr>
+            <w:tcW w:w="400" w:type="dxa"/>
+          </w:tcPr>
+          <w:p>
+            <w:pPr>
+              <w:pStyle w:val="TableCell"/>
+              <w:keepNext/>
+              <w:ind w:firstLine="0"/>
+              <w:jc w:val="left"/>
+            </w:pPr>
+            <w:r>
+              <w:t xml:space="preserve">2</w:t>
+            </w:r>
+          </w:p>
+        </w:tc>
+        <w:tc>
+          <w:tcPr>
+            <w:tcW w:w="400" w:type="dxa"/>
+          </w:tcPr>
+          <w:p>
+            <w:pPr>
+              <w:pStyle w:val="TableCell"/>
+              <w:keepNext/>
+              <w:ind w:firstLine="0"/>
+              <w:jc w:val="left"/>
+            </w:pPr>
+            <w:r>
+              <w:t xml:space="preserve">123</w:t>
             </w:r>
           </w:p>
         </w:tc>
@@ -12880,7 +14272,7 @@
         </w:tc>
         <w:tc>
           <w:tcPr>
-            <w:tcW w:w="2900" w:type="dxa"/>
+            <w:tcW w:w="2300" w:type="dxa"/>
           </w:tcPr>
           <w:p>
             <w:pPr>
@@ -12916,7 +14308,7 @@
         </w:tc>
         <w:tc>
           <w:tcPr>
-            <w:tcW w:w="1200" w:type="dxa"/>
+            <w:tcW w:w="1000" w:type="dxa"/>
           </w:tcPr>
           <w:p>
             <w:pPr>
@@ -12943,6 +14335,38 @@
             </w:pPr>
             <w:r>
               <w:t xml:space="preserve">ConfigExtractor</w:t>
+            </w:r>
+          </w:p>
+        </w:tc>
+        <w:tc>
+          <w:tcPr>
+            <w:tcW w:w="400" w:type="dxa"/>
+          </w:tcPr>
+          <w:p>
+            <w:pPr>
+              <w:pStyle w:val="TableCell"/>
+              <w:keepNext/>
+              <w:ind w:firstLine="0"/>
+              <w:jc w:val="left"/>
+            </w:pPr>
+            <w:r>
+              <w:t xml:space="preserve">3</w:t>
+            </w:r>
+          </w:p>
+        </w:tc>
+        <w:tc>
+          <w:tcPr>
+            <w:tcW w:w="400" w:type="dxa"/>
+          </w:tcPr>
+          <w:p>
+            <w:pPr>
+              <w:pStyle w:val="TableCell"/>
+              <w:keepNext/>
+              <w:ind w:firstLine="0"/>
+              <w:jc w:val="left"/>
+            </w:pPr>
+            <w:r>
+              <w:t xml:space="preserve">25</w:t>
             </w:r>
           </w:p>
         </w:tc>
@@ -12969,7 +14393,7 @@
         </w:tc>
         <w:tc>
           <w:tcPr>
-            <w:tcW w:w="2900" w:type="dxa"/>
+            <w:tcW w:w="2300" w:type="dxa"/>
           </w:tcPr>
           <w:p>
             <w:pPr>
@@ -12985,7 +14409,7 @@
         </w:tc>
         <w:tc>
           <w:tcPr>
-            <w:tcW w:w="1200" w:type="dxa"/>
+            <w:tcW w:w="1000" w:type="dxa"/>
           </w:tcPr>
           <w:p>
             <w:pPr>
@@ -13012,6 +14436,38 @@
             </w:pPr>
             <w:r>
               <w:t xml:space="preserve">ConfigExtractor、ServiceRootScanner、CodeGraphMerger</w:t>
+            </w:r>
+          </w:p>
+        </w:tc>
+        <w:tc>
+          <w:tcPr>
+            <w:tcW w:w="400" w:type="dxa"/>
+          </w:tcPr>
+          <w:p>
+            <w:pPr>
+              <w:pStyle w:val="TableCell"/>
+              <w:keepNext/>
+              <w:ind w:firstLine="0"/>
+              <w:jc w:val="left"/>
+            </w:pPr>
+            <w:r>
+              <w:t xml:space="preserve">8</w:t>
+            </w:r>
+          </w:p>
+        </w:tc>
+        <w:tc>
+          <w:tcPr>
+            <w:tcW w:w="400" w:type="dxa"/>
+          </w:tcPr>
+          <w:p>
+            <w:pPr>
+              <w:pStyle w:val="TableCell"/>
+              <w:keepNext/>
+              <w:ind w:firstLine="0"/>
+              <w:jc w:val="left"/>
+            </w:pPr>
+            <w:r>
+              <w:t xml:space="preserve">53</w:t>
             </w:r>
           </w:p>
         </w:tc>
@@ -13038,7 +14494,7 @@
         </w:tc>
         <w:tc>
           <w:tcPr>
-            <w:tcW w:w="2900" w:type="dxa"/>
+            <w:tcW w:w="2300" w:type="dxa"/>
           </w:tcPr>
           <w:p>
             <w:pPr>
@@ -13061,7 +14517,7 @@
         </w:tc>
         <w:tc>
           <w:tcPr>
-            <w:tcW w:w="1200" w:type="dxa"/>
+            <w:tcW w:w="1000" w:type="dxa"/>
           </w:tcPr>
           <w:p>
             <w:pPr>
@@ -13088,6 +14544,38 @@
             </w:pPr>
             <w:r>
               <w:t xml:space="preserve">CodeGraphMerger</w:t>
+            </w:r>
+          </w:p>
+        </w:tc>
+        <w:tc>
+          <w:tcPr>
+            <w:tcW w:w="400" w:type="dxa"/>
+          </w:tcPr>
+          <w:p>
+            <w:pPr>
+              <w:pStyle w:val="TableCell"/>
+              <w:keepNext/>
+              <w:ind w:firstLine="0"/>
+              <w:jc w:val="left"/>
+            </w:pPr>
+            <w:r>
+              <w:t xml:space="preserve">2</w:t>
+            </w:r>
+          </w:p>
+        </w:tc>
+        <w:tc>
+          <w:tcPr>
+            <w:tcW w:w="400" w:type="dxa"/>
+          </w:tcPr>
+          <w:p>
+            <w:pPr>
+              <w:pStyle w:val="TableCell"/>
+              <w:keepNext/>
+              <w:ind w:firstLine="0"/>
+              <w:jc w:val="left"/>
+            </w:pPr>
+            <w:r>
+              <w:t xml:space="preserve">3</w:t>
             </w:r>
           </w:p>
         </w:tc>
@@ -13113,7 +14601,7 @@
         </w:tc>
         <w:tc>
           <w:tcPr>
-            <w:tcW w:w="2900" w:type="dxa"/>
+            <w:tcW w:w="2300" w:type="dxa"/>
           </w:tcPr>
           <w:p>
             <w:pPr>
@@ -13128,7 +14616,7 @@
         </w:tc>
         <w:tc>
           <w:tcPr>
-            <w:tcW w:w="1200" w:type="dxa"/>
+            <w:tcW w:w="1000" w:type="dxa"/>
           </w:tcPr>
           <w:p>
             <w:pPr>
@@ -13153,6 +14641,36 @@
             </w:pPr>
             <w:r>
               <w:t xml:space="preserve">ConfigExtractor</w:t>
+            </w:r>
+          </w:p>
+        </w:tc>
+        <w:tc>
+          <w:tcPr>
+            <w:tcW w:w="400" w:type="dxa"/>
+          </w:tcPr>
+          <w:p>
+            <w:pPr>
+              <w:pStyle w:val="TableCell"/>
+              <w:ind w:firstLine="0"/>
+              <w:jc w:val="left"/>
+            </w:pPr>
+            <w:r>
+              <w:t xml:space="preserve">1</w:t>
+            </w:r>
+          </w:p>
+        </w:tc>
+        <w:tc>
+          <w:tcPr>
+            <w:tcW w:w="400" w:type="dxa"/>
+          </w:tcPr>
+          <w:p>
+            <w:pPr>
+              <w:pStyle w:val="TableCell"/>
+              <w:ind w:firstLine="0"/>
+              <w:jc w:val="left"/>
+            </w:pPr>
+            <w:r>
+              <w:t xml:space="preserve">5</w:t>
             </w:r>
           </w:p>
         </w:tc>

</xml_diff>